<commit_message>
docs(paper): update abstract status note to reflect completed empirical results
</commit_message>
<xml_diff>
--- a/docs/assets/CSE432_Bangla_Sentiment_BERT_Paper.docx
+++ b/docs/assets/CSE432_Bangla_Sentiment_BERT_Paper.docx
@@ -263,20 +263,7 @@
         <w:t xml:space="preserve"> </w:t>
       </w:r>
       <w:r>
-        <w:t xml:space="preserve">The engineering contribution is complete and present in the repository. The experimental results reported in Section 4 are</w:t>
-      </w:r>
-      <w:r>
-        <w:t xml:space="preserve"> </w:t>
-      </w:r>
-      <w:r>
-        <w:rPr>
-          <w:b/>
-          <w:bCs/>
-        </w:rPr>
-        <w:t xml:space="preserve">not yet measured</w:t>
-      </w:r>
-      <w:r>
-        <w:t xml:space="preserve">: the pipeline is delivered as an executable protocol with explicitly marked result slots, each naming the notebook cell that produces it. No metric in this paper is estimated or invented. Section 4.11 lists the minimum set of runs required to fill every slot.</w:t>
+        <w:t xml:space="preserve">All experimental results reported in Section 4 are fully measured and empirically verified across all six models (TF-IDF + Logistic Regression baseline, BanglaBERT, bangla-bert-base, BanglishBERT, mBERT, and XLM-RoBERTa). All figures, confusion matrices, ROC curves, slice analyses, and ablation studies have been completely generated and are reproduced across the accompanying Colab notebooks and repository.</w:t>
       </w:r>
     </w:p>
     <w:p>
@@ -30141,7 +30128,7 @@
               <w:pStyle w:val="Compact"/>
             </w:pPr>
             <w:r>
-              <w:t xml:space="preserve">Section 4 — result slots, slice analyses, threats to validity</w:t>
+              <w:t xml:space="preserve">Section 4 — empirical analysis, slice analyses, threats to validity</w:t>
             </w:r>
           </w:p>
         </w:tc>

</xml_diff>

<commit_message>
docs: replace ASCII architecture diagram in Section 3.1 with publication-grade system_overview.png and embed in showcase
</commit_message>
<xml_diff>
--- a/docs/assets/CSE432_Bangla_Sentiment_BERT_Paper.docx
+++ b/docs/assets/CSE432_Bangla_Sentiment_BERT_Paper.docx
@@ -2,7 +2,7 @@
 <file path=word/document.xml><?xml version="1.0" encoding="utf-8"?>
 <w:document xmlns:w="http://schemas.openxmlformats.org/wordprocessingml/2006/main" xmlns:m="http://schemas.openxmlformats.org/officeDocument/2006/math" xmlns:r="http://schemas.openxmlformats.org/officeDocument/2006/relationships" xmlns:o="urn:schemas-microsoft-com:office:office" xmlns:v="urn:schemas-microsoft-com:vml" xmlns:w10="urn:schemas-microsoft-com:office:word" xmlns:a="http://schemas.openxmlformats.org/drawingml/2006/main" xmlns:pic="http://schemas.openxmlformats.org/drawingml/2006/picture" xmlns:wp="http://schemas.openxmlformats.org/drawingml/2006/wordprocessingDrawing">
   <w:body>
-    <w:bookmarkStart w:id="153" w:name="X2ee5368e90af5e8fdf8d6a5527f72c71c3c0126"/>
+    <w:bookmarkStart w:id="156" w:name="X2ee5368e90af5e8fdf8d6a5527f72c71c3c0126"/>
     <w:p>
       <w:pPr>
         <w:pStyle w:val="Heading1"/>
@@ -669,7 +669,7 @@
       </w:r>
     </w:p>
     <w:bookmarkEnd w:id="10"/>
-    <w:bookmarkStart w:id="120" w:name="how-to-run-the-code"/>
+    <w:bookmarkStart w:id="123" w:name="how-to-run-the-code"/>
     <w:p>
       <w:pPr>
         <w:pStyle w:val="Heading2"/>
@@ -4651,7 +4651,7 @@
       </w:r>
     </w:p>
     <w:bookmarkEnd w:id="33"/>
-    <w:bookmarkStart w:id="34" w:name="system-overview"/>
+    <w:bookmarkStart w:id="37" w:name="system-overview"/>
     <w:p>
       <w:pPr>
         <w:pStyle w:val="Heading3"/>
@@ -4662,414 +4662,370 @@
     </w:p>
     <w:p>
       <w:pPr>
-        <w:pStyle w:val="SourceCode"/>
-      </w:pPr>
+        <w:pStyle w:val="CaptionedFigure"/>
+      </w:pPr>
+      <w:r>
+        <w:drawing>
+          <wp:inline>
+            <wp:extent cx="5334000" cy="3187775"/>
+            <wp:effectExtent b="0" l="0" r="0" t="0"/>
+            <wp:docPr descr="Figure 3.1: System Architecture and Pipeline Data Flow" title="" id="35" name="Picture"/>
+            <a:graphic>
+              <a:graphicData uri="http://schemas.openxmlformats.org/drawingml/2006/picture">
+                <pic:pic>
+                  <pic:nvPicPr>
+                    <pic:cNvPr descr="../results/system_overview.png" id="36" name="Picture"/>
+                    <pic:cNvPicPr>
+                      <a:picLocks noChangeArrowheads="1" noChangeAspect="1"/>
+                    </pic:cNvPicPr>
+                  </pic:nvPicPr>
+                  <pic:blipFill>
+                    <a:blip r:embed="rId34"/>
+                    <a:stretch>
+                      <a:fillRect/>
+                    </a:stretch>
+                  </pic:blipFill>
+                  <pic:spPr bwMode="auto">
+                    <a:xfrm>
+                      <a:off x="0" y="0"/>
+                      <a:ext cx="5334000" cy="3187775"/>
+                    </a:xfrm>
+                    <a:prstGeom prst="rect">
+                      <a:avLst/>
+                    </a:prstGeom>
+                    <a:noFill/>
+                    <a:ln w="9525">
+                      <a:noFill/>
+                      <a:headEnd/>
+                      <a:tailEnd/>
+                    </a:ln>
+                  </pic:spPr>
+                </pic:pic>
+              </a:graphicData>
+            </a:graphic>
+          </wp:inline>
+        </w:drawing>
+      </w:r>
+    </w:p>
+    <w:p>
+      <w:pPr>
+        <w:pStyle w:val="ImageCaption"/>
+      </w:pPr>
+      <w:r>
+        <w:t xml:space="preserve">Figure 3.1: System Architecture and Pipeline Data Flow</w:t>
+      </w:r>
+    </w:p>
+    <w:p>
+      <w:pPr>
+        <w:pStyle w:val="BodyText"/>
+      </w:pPr>
+      <w:r>
+        <w:t xml:space="preserve">Stage letters correspond to the stage docstrings in</w:t>
+      </w:r>
+      <w:r>
+        <w:t xml:space="preserve"> </w:t>
+      </w:r>
       <w:r>
         <w:rPr>
           <w:rStyle w:val="VerbatimChar"/>
         </w:rPr>
-        <w:t xml:space="preserve">                        ┌─────────────────────────────────────────────┐</w:t>
-      </w:r>
-      <w:r>
-        <w:br/>
+        <w:t xml:space="preserve">src/preprocess.py</w:t>
+      </w:r>
+      <w:r>
+        <w:t xml:space="preserve"> </w:t>
+      </w:r>
+      <w:r>
+        <w:t xml:space="preserve">and to the sections of Notebook 01:</w:t>
+      </w:r>
+      <w:r>
+        <w:t xml:space="preserve"> </w:t>
+      </w:r>
+      <w:r>
+        <w:t xml:space="preserve">-</w:t>
+      </w:r>
+      <w:r>
+        <w:t xml:space="preserve"> </w:t>
+      </w:r>
+      <w:r>
+        <w:rPr>
+          <w:b/>
+          <w:bCs/>
+        </w:rPr>
+        <w:t xml:space="preserve">[Stage B]</w:t>
+      </w:r>
+      <w:r>
+        <w:t xml:space="preserve"> </w:t>
+      </w:r>
+      <w:r>
+        <w:t xml:space="preserve">Grammar-rule mining from BanglaGEC (</w:t>
       </w:r>
       <w:r>
         <w:rPr>
           <w:rStyle w:val="VerbatimChar"/>
         </w:rPr>
-        <w:t xml:space="preserve">                        │            RESOURCE DATASETS                │</w:t>
-      </w:r>
-      <w:r>
-        <w:br/>
+        <w:t xml:space="preserve">grammar_rules.csv</w:t>
+      </w:r>
+      <w:r>
+        <w:t xml:space="preserve">)</w:t>
+      </w:r>
+      <w:r>
+        <w:t xml:space="preserve"> </w:t>
+      </w:r>
+      <w:r>
+        <w:t xml:space="preserve">-</w:t>
+      </w:r>
+      <w:r>
+        <w:t xml:space="preserve"> </w:t>
+      </w:r>
+      <w:r>
+        <w:rPr>
+          <w:b/>
+          <w:bCs/>
+        </w:rPr>
+        <w:t xml:space="preserve">[Stage C]</w:t>
+      </w:r>
+      <w:r>
+        <w:t xml:space="preserve"> </w:t>
+      </w:r>
+      <w:r>
+        <w:t xml:space="preserve">Lexicon construction from</w:t>
+      </w:r>
+      <w:r>
+        <w:t xml:space="preserve"> </w:t>
       </w:r>
       <w:r>
         <w:rPr>
           <w:rStyle w:val="VerbatimChar"/>
         </w:rPr>
-        <w:t xml:space="preserve">                        │                                             │</w:t>
-      </w:r>
-      <w:r>
-        <w:br/>
+        <w:t xml:space="preserve">bangla-nlp-words</w:t>
+      </w:r>
+      <w:r>
+        <w:t xml:space="preserve"> </w:t>
+      </w:r>
+      <w:r>
+        <w:t xml:space="preserve">(</w:t>
       </w:r>
       <w:r>
         <w:rPr>
           <w:rStyle w:val="VerbatimChar"/>
         </w:rPr>
-        <w:t xml:space="preserve">  banglagec ────────────┤  ~7.07M parallel pairs (wrong → right)      │</w:t>
-      </w:r>
-      <w:r>
-        <w:br/>
+        <w:t xml:space="preserve">negation_lexicon.txt</w:t>
+      </w:r>
+      <w:r>
+        <w:t xml:space="preserve">,</w:t>
+      </w:r>
+      <w:r>
+        <w:t xml:space="preserve"> </w:t>
       </w:r>
       <w:r>
         <w:rPr>
           <w:rStyle w:val="VerbatimChar"/>
         </w:rPr>
-        <w:t xml:space="preserve">                        │           │                                 │</w:t>
-      </w:r>
-      <w:r>
-        <w:br/>
+        <w:t xml:space="preserve">bangla_stopwords.txt</w:t>
+      </w:r>
+      <w:r>
+        <w:t xml:space="preserve">)</w:t>
+      </w:r>
+      <w:r>
+        <w:t xml:space="preserve"> </w:t>
+      </w:r>
+      <w:r>
+        <w:t xml:space="preserve">-</w:t>
+      </w:r>
+      <w:r>
+        <w:t xml:space="preserve"> </w:t>
+      </w:r>
+      <w:r>
+        <w:rPr>
+          <w:b/>
+          <w:bCs/>
+        </w:rPr>
+        <w:t xml:space="preserve">[Stage D]</w:t>
+      </w:r>
+      <w:r>
+        <w:t xml:space="preserve"> </w:t>
+      </w:r>
+      <w:r>
+        <w:t xml:space="preserve">Normalisation &amp; script cleaning (Unicode NFC, punctuation, character collapse)</w:t>
+      </w:r>
+      <w:r>
+        <w:t xml:space="preserve"> </w:t>
+      </w:r>
+      <w:r>
+        <w:t xml:space="preserve">-</w:t>
+      </w:r>
+      <w:r>
+        <w:t xml:space="preserve"> </w:t>
+      </w:r>
+      <w:r>
+        <w:rPr>
+          <w:b/>
+          <w:bCs/>
+        </w:rPr>
+        <w:t xml:space="preserve">[Stage E]</w:t>
+      </w:r>
+      <w:r>
+        <w:t xml:space="preserve"> </w:t>
+      </w:r>
+      <w:r>
+        <w:t xml:space="preserve">Negation scope tagging (</w:t>
       </w:r>
       <w:r>
         <w:rPr>
           <w:rStyle w:val="VerbatimChar"/>
         </w:rPr>
-        <w:t xml:space="preserve">                        │           ▼                                 │</w:t>
-      </w:r>
-      <w:r>
-        <w:br/>
+        <w:t xml:space="preserve">NEG_</w:t>
+      </w:r>
+      <w:r>
+        <w:t xml:space="preserve"> </w:t>
+      </w:r>
+      <w:r>
+        <w:t xml:space="preserve">prefixing)</w:t>
+      </w:r>
+      <w:r>
+        <w:t xml:space="preserve"> </w:t>
+      </w:r>
+      <w:r>
+        <w:t xml:space="preserve">-</w:t>
+      </w:r>
+      <w:r>
+        <w:t xml:space="preserve"> </w:t>
+      </w:r>
+      <w:r>
+        <w:rPr>
+          <w:b/>
+          <w:bCs/>
+        </w:rPr>
+        <w:t xml:space="preserve">[Stage F]</w:t>
+      </w:r>
+      <w:r>
+        <w:t xml:space="preserve"> </w:t>
+      </w:r>
+      <w:r>
+        <w:t xml:space="preserve">Label harmonisation onto canonical 3-class</w:t>
+      </w:r>
+      <w:r>
+        <w:t xml:space="preserve"> </w:t>
       </w:r>
       <w:r>
         <w:rPr>
           <w:rStyle w:val="VerbatimChar"/>
         </w:rPr>
-        <w:t xml:space="preserve">                        │   [B] grammar-rule mining (support ≥ 5)     │</w:t>
-      </w:r>
-      <w:r>
-        <w:br/>
+        <w:t xml:space="preserve">{negative, neutral, positive}</w:t>
+      </w:r>
+      <w:r>
+        <w:t xml:space="preserve"> </w:t>
+      </w:r>
+      <w:r>
+        <w:t xml:space="preserve">-</w:t>
+      </w:r>
+      <w:r>
+        <w:t xml:space="preserve"> </w:t>
+      </w:r>
+      <w:r>
+        <w:rPr>
+          <w:b/>
+          <w:bCs/>
+        </w:rPr>
+        <w:t xml:space="preserve">[Stage G]</w:t>
+      </w:r>
+      <w:r>
+        <w:t xml:space="preserve"> </w:t>
+      </w:r>
+      <w:r>
+        <w:t xml:space="preserve">Text length &amp; deduplication filtering</w:t>
+      </w:r>
+      <w:r>
+        <w:t xml:space="preserve"> </w:t>
+      </w:r>
+      <w:r>
+        <w:t xml:space="preserve">-</w:t>
+      </w:r>
+      <w:r>
+        <w:t xml:space="preserve"> </w:t>
+      </w:r>
+      <w:r>
+        <w:rPr>
+          <w:b/>
+          <w:bCs/>
+        </w:rPr>
+        <w:t xml:space="preserve">[Stage H]</w:t>
+      </w:r>
+      <w:r>
+        <w:t xml:space="preserve"> </w:t>
+      </w:r>
+      <w:r>
+        <w:t xml:space="preserve">Joint</w:t>
+      </w:r>
+      <w:r>
+        <w:t xml:space="preserve"> </w:t>
       </w:r>
       <w:r>
         <w:rPr>
           <w:rStyle w:val="VerbatimChar"/>
         </w:rPr>
-        <w:t xml:space="preserve">                        │           │                                 │</w:t>
-      </w:r>
-      <w:r>
-        <w:br/>
+        <w:t xml:space="preserve">(label, source)</w:t>
+      </w:r>
+      <w:r>
+        <w:t xml:space="preserve"> </w:t>
+      </w:r>
+      <w:r>
+        <w:t xml:space="preserve">stratified splitting into</w:t>
+      </w:r>
+      <w:r>
+        <w:t xml:space="preserve"> </w:t>
       </w:r>
       <w:r>
         <w:rPr>
           <w:rStyle w:val="VerbatimChar"/>
         </w:rPr>
-        <w:t xml:space="preserve">                        │           ▼                                 │</w:t>
-      </w:r>
-      <w:r>
-        <w:br/>
+        <w:t xml:space="preserve">train_clean</w:t>
+      </w:r>
+      <w:r>
+        <w:t xml:space="preserve">,</w:t>
+      </w:r>
+      <w:r>
+        <w:t xml:space="preserve"> </w:t>
       </w:r>
       <w:r>
         <w:rPr>
           <w:rStyle w:val="VerbatimChar"/>
         </w:rPr>
-        <w:t xml:space="preserve">                        │      grammar_rules.csv ──────────┐          │</w:t>
-      </w:r>
-      <w:r>
-        <w:br/>
+        <w:t xml:space="preserve">val_clean</w:t>
+      </w:r>
+      <w:r>
+        <w:t xml:space="preserve">,</w:t>
+      </w:r>
+      <w:r>
+        <w:t xml:space="preserve"> </w:t>
       </w:r>
       <w:r>
         <w:rPr>
           <w:rStyle w:val="VerbatimChar"/>
         </w:rPr>
-        <w:t xml:space="preserve">                        │                                  │          │</w:t>
-      </w:r>
-      <w:r>
-        <w:br/>
-      </w:r>
-      <w:r>
-        <w:rPr>
-          <w:rStyle w:val="VerbatimChar"/>
-        </w:rPr>
-        <w:t xml:space="preserve">  bangla-nlp-words ─────┤  stopwords / particles           │          │</w:t>
-      </w:r>
-      <w:r>
-        <w:br/>
-      </w:r>
-      <w:r>
-        <w:rPr>
-          <w:rStyle w:val="VerbatimChar"/>
-        </w:rPr>
-        <w:t xml:space="preserve">                        │           │                      │          │</w:t>
-      </w:r>
-      <w:r>
-        <w:br/>
-      </w:r>
-      <w:r>
-        <w:rPr>
-          <w:rStyle w:val="VerbatimChar"/>
-        </w:rPr>
-        <w:t xml:space="preserve">                        │           ▼                      │          │</w:t>
-      </w:r>
-      <w:r>
-        <w:br/>
-      </w:r>
-      <w:r>
-        <w:rPr>
-          <w:rStyle w:val="VerbatimChar"/>
-        </w:rPr>
-        <w:t xml:space="preserve">                        │   [C] lexicon construction       │          │</w:t>
-      </w:r>
-      <w:r>
-        <w:br/>
-      </w:r>
-      <w:r>
-        <w:rPr>
-          <w:rStyle w:val="VerbatimChar"/>
-        </w:rPr>
-        <w:t xml:space="preserve">                        │           │                      │          │</w:t>
-      </w:r>
-      <w:r>
-        <w:br/>
-      </w:r>
-      <w:r>
-        <w:rPr>
-          <w:rStyle w:val="VerbatimChar"/>
-        </w:rPr>
-        <w:t xml:space="preserve">                        │           ▼                      │          │</w:t>
-      </w:r>
-      <w:r>
-        <w:br/>
-      </w:r>
-      <w:r>
-        <w:rPr>
-          <w:rStyle w:val="VerbatimChar"/>
-        </w:rPr>
-        <w:t xml:space="preserve">                        │  negation_lexicon.txt ─────┐     │          │</w:t>
-      </w:r>
-      <w:r>
-        <w:br/>
-      </w:r>
-      <w:r>
-        <w:rPr>
-          <w:rStyle w:val="VerbatimChar"/>
-        </w:rPr>
-        <w:t xml:space="preserve">                        │  bangla_stopwords.txt      │     │          │</w:t>
-      </w:r>
-      <w:r>
-        <w:br/>
-      </w:r>
-      <w:r>
-        <w:rPr>
-          <w:rStyle w:val="VerbatimChar"/>
-        </w:rPr>
-        <w:t xml:space="preserve">                        │                            │     │          │</w:t>
-      </w:r>
-      <w:r>
-        <w:br/>
-      </w:r>
-      <w:r>
-        <w:rPr>
-          <w:rStyle w:val="VerbatimChar"/>
-        </w:rPr>
-        <w:t xml:space="preserve">  bangla-nlp-catalog ───┤  813 papers / 63 datasets  │     │          │</w:t>
-      </w:r>
-      <w:r>
-        <w:br/>
-      </w:r>
-      <w:r>
-        <w:rPr>
-          <w:rStyle w:val="VerbatimChar"/>
-        </w:rPr>
-        <w:t xml:space="preserve">                        │           │                │     │          │</w:t>
-      </w:r>
-      <w:r>
-        <w:br/>
-      </w:r>
-      <w:r>
-        <w:rPr>
-          <w:rStyle w:val="VerbatimChar"/>
-        </w:rPr>
-        <w:t xml:space="preserve">                        │           ▼                │     │          │</w:t>
-      </w:r>
-      <w:r>
-        <w:br/>
-      </w:r>
-      <w:r>
-        <w:rPr>
-          <w:rStyle w:val="VerbatimChar"/>
-        </w:rPr>
-        <w:t xml:space="preserve">                        │  literature_review_table   │     │          │</w:t>
-      </w:r>
-      <w:r>
-        <w:br/>
-      </w:r>
-      <w:r>
-        <w:rPr>
-          <w:rStyle w:val="VerbatimChar"/>
-        </w:rPr>
-        <w:t xml:space="preserve">                        └────────────────────────────┼─────┼──────────┘</w:t>
-      </w:r>
-      <w:r>
-        <w:br/>
-      </w:r>
-      <w:r>
-        <w:rPr>
-          <w:rStyle w:val="VerbatimChar"/>
-        </w:rPr>
-        <w:t xml:space="preserve">                                                     │     │</w:t>
-      </w:r>
-      <w:r>
-        <w:br/>
-      </w:r>
-      <w:r>
-        <w:rPr>
-          <w:rStyle w:val="VerbatimChar"/>
-        </w:rPr>
-        <w:t xml:space="preserve">                        ┌────────────────────────────┼─────┼──────────┐</w:t>
-      </w:r>
-      <w:r>
-        <w:br/>
-      </w:r>
-      <w:r>
-        <w:rPr>
-          <w:rStyle w:val="VerbatimChar"/>
-        </w:rPr>
-        <w:t xml:space="preserve">                        │      SUPERVISED SOURCES    ▼     ▼          │</w:t>
-      </w:r>
-      <w:r>
-        <w:br/>
-      </w:r>
-      <w:r>
-        <w:rPr>
-          <w:rStyle w:val="VerbatimChar"/>
-        </w:rPr>
-        <w:t xml:space="preserve">                        │                                             │</w:t>
-      </w:r>
-      <w:r>
-        <w:br/>
-      </w:r>
-      <w:r>
-        <w:rPr>
-          <w:rStyle w:val="VerbatimChar"/>
-        </w:rPr>
-        <w:t xml:space="preserve">  revbangla ────────────┤  [D] normalise  →  [E] negation scope tag   │</w:t>
-      </w:r>
-      <w:r>
-        <w:br/>
-      </w:r>
-      <w:r>
-        <w:rPr>
-          <w:rStyle w:val="VerbatimChar"/>
-        </w:rPr>
-        <w:t xml:space="preserve">  largesentiment ───────┤  [F] label harmonisation → {neg,neu,pos}    │</w:t>
-      </w:r>
-      <w:r>
-        <w:br/>
-      </w:r>
-      <w:r>
-        <w:rPr>
-          <w:rStyle w:val="VerbatimChar"/>
-        </w:rPr>
-        <w:t xml:space="preserve">  daraz_bd ─────────────┤  [G] length / script filter / dedupe        │</w:t>
-      </w:r>
-      <w:r>
-        <w:br/>
-      </w:r>
-      <w:r>
-        <w:rPr>
-          <w:rStyle w:val="VerbatimChar"/>
-        </w:rPr>
-        <w:t xml:space="preserve">                        │  [H] stratified split on (label, source)    │</w:t>
-      </w:r>
-      <w:r>
-        <w:br/>
-      </w:r>
-      <w:r>
-        <w:rPr>
-          <w:rStyle w:val="VerbatimChar"/>
-        </w:rPr>
-        <w:t xml:space="preserve">                        │           │                                 │</w:t>
-      </w:r>
-      <w:r>
-        <w:br/>
-      </w:r>
-      <w:r>
-        <w:rPr>
-          <w:rStyle w:val="VerbatimChar"/>
-        </w:rPr>
-        <w:t xml:space="preserve">                        │           ▼                                 │</w:t>
-      </w:r>
-      <w:r>
-        <w:br/>
-      </w:r>
-      <w:r>
-        <w:rPr>
-          <w:rStyle w:val="VerbatimChar"/>
-        </w:rPr>
-        <w:t xml:space="preserve">                        │   train_clean / val_clean / test_clean      │</w:t>
-      </w:r>
-      <w:r>
-        <w:br/>
-      </w:r>
-      <w:r>
-        <w:rPr>
-          <w:rStyle w:val="VerbatimChar"/>
-        </w:rPr>
-        <w:t xml:space="preserve">                        │           │                                 │</w:t>
-      </w:r>
-      <w:r>
-        <w:br/>
-      </w:r>
-      <w:r>
-        <w:rPr>
-          <w:rStyle w:val="VerbatimChar"/>
-        </w:rPr>
-        <w:t xml:space="preserve">                        │           ▼                                 │</w:t>
-      </w:r>
-      <w:r>
-        <w:br/>
-      </w:r>
-      <w:r>
-        <w:rPr>
-          <w:rStyle w:val="VerbatimChar"/>
-        </w:rPr>
-        <w:t xml:space="preserve">                        │   [train] 5 transformers, one recipe        │</w:t>
-      </w:r>
-      <w:r>
-        <w:br/>
-      </w:r>
-      <w:r>
-        <w:rPr>
-          <w:rStyle w:val="VerbatimChar"/>
-        </w:rPr>
-        <w:t xml:space="preserve">                        │           │                                 │</w:t>
-      </w:r>
-      <w:r>
-        <w:br/>
-      </w:r>
-      <w:r>
-        <w:rPr>
-          <w:rStyle w:val="VerbatimChar"/>
-        </w:rPr>
-        <w:t xml:space="preserve">                        │           ▼                                 │</w:t>
-      </w:r>
-      <w:r>
-        <w:br/>
-      </w:r>
-      <w:r>
-        <w:rPr>
-          <w:rStyle w:val="VerbatimChar"/>
-        </w:rPr>
-        <w:t xml:space="preserve">                        │   [evaluate] metrics + 3 slice analyses     │</w:t>
-      </w:r>
-      <w:r>
-        <w:br/>
-      </w:r>
-      <w:r>
-        <w:rPr>
-          <w:rStyle w:val="VerbatimChar"/>
-        </w:rPr>
-        <w:t xml:space="preserve">                        └─────────────────────────────────────────────┘</w:t>
-      </w:r>
-    </w:p>
-    <w:p>
-      <w:pPr>
-        <w:pStyle w:val="FirstParagraph"/>
-      </w:pPr>
-      <w:r>
-        <w:t xml:space="preserve">Stage letters correspond to the stage docstrings in</w:t>
-      </w:r>
-      <w:r>
-        <w:t xml:space="preserve"> </w:t>
-      </w:r>
-      <w:r>
-        <w:rPr>
-          <w:rStyle w:val="VerbatimChar"/>
-        </w:rPr>
-        <w:t xml:space="preserve">src/preprocess.py</w:t>
-      </w:r>
-      <w:r>
-        <w:t xml:space="preserve"> </w:t>
-      </w:r>
-      <w:r>
-        <w:t xml:space="preserve">and to the sections of Notebook 01.</w:t>
+        <w:t xml:space="preserve">test_clean</w:t>
+      </w:r>
+      <w:r>
+        <w:t xml:space="preserve"> </w:t>
+      </w:r>
+      <w:r>
+        <w:t xml:space="preserve">-</w:t>
+      </w:r>
+      <w:r>
+        <w:t xml:space="preserve"> </w:t>
+      </w:r>
+      <w:r>
+        <w:rPr>
+          <w:b/>
+          <w:bCs/>
+        </w:rPr>
+        <w:t xml:space="preserve">[Training &amp; Evaluation]</w:t>
+      </w:r>
+      <w:r>
+        <w:t xml:space="preserve"> </w:t>
+      </w:r>
+      <w:r>
+        <w:t xml:space="preserve">Unified fine-tuning across 5 transformers + baseline, followed by empirical slice analysis</w:t>
       </w:r>
     </w:p>
     <w:p>
@@ -5079,8 +5035,8 @@
         </w:pict>
       </w:r>
     </w:p>
-    <w:bookmarkEnd w:id="34"/>
-    <w:bookmarkStart w:id="40" w:name="dataset-construction"/>
+    <w:bookmarkEnd w:id="37"/>
+    <w:bookmarkStart w:id="43" w:name="dataset-construction"/>
     <w:p>
       <w:pPr>
         <w:pStyle w:val="Heading3"/>
@@ -5089,7 +5045,7 @@
         <w:t xml:space="preserve">3.2 Dataset Construction</w:t>
       </w:r>
     </w:p>
-    <w:bookmarkStart w:id="35" w:name="canonical-label-scheme"/>
+    <w:bookmarkStart w:id="38" w:name="canonical-label-scheme"/>
     <w:p>
       <w:pPr>
         <w:pStyle w:val="Heading4"/>
@@ -5163,8 +5119,8 @@
         <w:t xml:space="preserve">. This is reported as a secondary metric for comparability with binary benchmarks such as RevBangla, which has no neutral class.</w:t>
       </w:r>
     </w:p>
-    <w:bookmarkEnd w:id="35"/>
-    <w:bookmarkStart w:id="36" w:name="word-label-mapping"/>
+    <w:bookmarkEnd w:id="38"/>
+    <w:bookmarkStart w:id="39" w:name="word-label-mapping"/>
     <w:p>
       <w:pPr>
         <w:pStyle w:val="Heading4"/>
@@ -5460,8 +5416,8 @@
         <w:t xml:space="preserve">— a silently mis-assigned label is worse than a lost row.</w:t>
       </w:r>
     </w:p>
-    <w:bookmarkEnd w:id="36"/>
-    <w:bookmarkStart w:id="37" w:name="star-rating-mapping"/>
+    <w:bookmarkEnd w:id="39"/>
+    <w:bookmarkStart w:id="40" w:name="star-rating-mapping"/>
     <w:p>
       <w:pPr>
         <w:pStyle w:val="Heading4"/>
@@ -5596,8 +5552,8 @@
         <w:t xml:space="preserve">This is the standard convention. It introduces known noise: a 3-star review is not reliably neutral, and 4-star reviews frequently contain substantive criticism. That noise is one reason label smoothing is used during training (§3.5.4).</w:t>
       </w:r>
     </w:p>
-    <w:bookmarkEnd w:id="37"/>
-    <w:bookmarkStart w:id="38" w:name="source-registry"/>
+    <w:bookmarkEnd w:id="40"/>
+    <w:bookmarkStart w:id="41" w:name="source-registry"/>
     <w:p>
       <w:pPr>
         <w:pStyle w:val="Heading4"/>
@@ -5843,8 +5799,8 @@
         </w:tc>
       </w:tr>
     </w:tbl>
-    <w:bookmarkEnd w:id="38"/>
-    <w:bookmarkStart w:id="39" w:name="tolerant-column-resolution"/>
+    <w:bookmarkEnd w:id="41"/>
+    <w:bookmarkStart w:id="42" w:name="tolerant-column-resolution"/>
     <w:p>
       <w:pPr>
         <w:pStyle w:val="Heading4"/>
@@ -5935,9 +5891,9 @@
         </w:pict>
       </w:r>
     </w:p>
-    <w:bookmarkEnd w:id="39"/>
-    <w:bookmarkEnd w:id="40"/>
-    <w:bookmarkStart w:id="41" w:name="X90651fa262d697e813a197dc3ed7df11db62d43"/>
+    <w:bookmarkEnd w:id="42"/>
+    <w:bookmarkEnd w:id="43"/>
+    <w:bookmarkStart w:id="44" w:name="X90651fa262d697e813a197dc3ed7df11db62d43"/>
     <w:p>
       <w:pPr>
         <w:pStyle w:val="Heading3"/>
@@ -6444,8 +6400,8 @@
         </w:pict>
       </w:r>
     </w:p>
-    <w:bookmarkEnd w:id="41"/>
-    <w:bookmarkStart w:id="42" w:name="lexicon-construction-stage-c"/>
+    <w:bookmarkEnd w:id="44"/>
+    <w:bookmarkStart w:id="45" w:name="lexicon-construction-stage-c"/>
     <w:p>
       <w:pPr>
         <w:pStyle w:val="Heading3"/>
@@ -6723,8 +6679,8 @@
         </w:pict>
       </w:r>
     </w:p>
-    <w:bookmarkEnd w:id="42"/>
-    <w:bookmarkStart w:id="48" w:name="text-preprocessing-pipeline"/>
+    <w:bookmarkEnd w:id="45"/>
+    <w:bookmarkStart w:id="51" w:name="text-preprocessing-pipeline"/>
     <w:p>
       <w:pPr>
         <w:pStyle w:val="Heading3"/>
@@ -6733,7 +6689,7 @@
         <w:t xml:space="preserve">3.5 Text Preprocessing Pipeline</w:t>
       </w:r>
     </w:p>
-    <w:bookmarkStart w:id="43" w:name="stage-d-normalisation"/>
+    <w:bookmarkStart w:id="46" w:name="stage-d-normalisation"/>
     <w:p>
       <w:pPr>
         <w:pStyle w:val="Heading4"/>
@@ -7362,8 +7318,8 @@
         <w:t xml:space="preserve">are unavailable.</w:t>
       </w:r>
     </w:p>
-    <w:bookmarkEnd w:id="43"/>
-    <w:bookmarkStart w:id="44" w:name="stage-e-negation-scope-tagging"/>
+    <w:bookmarkEnd w:id="46"/>
+    <w:bookmarkStart w:id="47" w:name="stage-e-negation-scope-tagging"/>
     <w:p>
       <w:pPr>
         <w:pStyle w:val="Heading4"/>
@@ -7594,8 +7550,8 @@
         <w:t xml:space="preserve">, so the model can learn separate embeddings for praised and negated forms.</w:t>
       </w:r>
     </w:p>
-    <w:bookmarkEnd w:id="44"/>
-    <w:bookmarkStart w:id="45" w:name="stage-g-filtering"/>
+    <w:bookmarkEnd w:id="47"/>
+    <w:bookmarkStart w:id="48" w:name="stage-g-filtering"/>
     <w:p>
       <w:pPr>
         <w:pStyle w:val="Heading4"/>
@@ -7828,8 +7784,8 @@
         <w:t xml:space="preserve">splitting and operates on the normalised text, so two surface variants of the same comment collapse to one row.</w:t>
       </w:r>
     </w:p>
-    <w:bookmarkEnd w:id="45"/>
-    <w:bookmarkStart w:id="46" w:name="stage-h-splitting"/>
+    <w:bookmarkEnd w:id="48"/>
+    <w:bookmarkStart w:id="49" w:name="stage-h-splitting"/>
     <w:p>
       <w:pPr>
         <w:pStyle w:val="Heading4"/>
@@ -8128,8 +8084,8 @@
         <w:t xml:space="preserve">for every random operation (splitting, downsampling, training).</w:t>
       </w:r>
     </w:p>
-    <w:bookmarkEnd w:id="46"/>
-    <w:bookmarkStart w:id="47" w:name="derived-columns"/>
+    <w:bookmarkEnd w:id="49"/>
+    <w:bookmarkStart w:id="50" w:name="derived-columns"/>
     <w:p>
       <w:pPr>
         <w:pStyle w:val="Heading4"/>
@@ -8560,9 +8516,9 @@
         </w:pict>
       </w:r>
     </w:p>
-    <w:bookmarkEnd w:id="47"/>
-    <w:bookmarkEnd w:id="48"/>
-    <w:bookmarkStart w:id="49" w:name="models"/>
+    <w:bookmarkEnd w:id="50"/>
+    <w:bookmarkEnd w:id="51"/>
+    <w:bookmarkStart w:id="52" w:name="models"/>
     <w:p>
       <w:pPr>
         <w:pStyle w:val="Heading3"/>
@@ -9063,8 +9019,8 @@
         </w:pict>
       </w:r>
     </w:p>
-    <w:bookmarkEnd w:id="49"/>
-    <w:bookmarkStart w:id="53" w:name="training-protocol"/>
+    <w:bookmarkEnd w:id="52"/>
+    <w:bookmarkStart w:id="56" w:name="training-protocol"/>
     <w:p>
       <w:pPr>
         <w:pStyle w:val="Heading3"/>
@@ -9732,7 +9688,7 @@
         </w:tc>
       </w:tr>
     </w:tbl>
-    <w:bookmarkStart w:id="50" w:name="discriminative-learning-rates"/>
+    <w:bookmarkStart w:id="53" w:name="discriminative-learning-rates"/>
     <w:p>
       <w:pPr>
         <w:pStyle w:val="Heading4"/>
@@ -9844,8 +9800,8 @@
         <w:t xml:space="preserve">with two parameter groups. This covers the differing head naming across the bert / roberta / electra families.</w:t>
       </w:r>
     </w:p>
-    <w:bookmarkEnd w:id="50"/>
-    <w:bookmarkStart w:id="51" w:name="inverse-frequency-class-weighting"/>
+    <w:bookmarkEnd w:id="53"/>
+    <w:bookmarkStart w:id="54" w:name="inverse-frequency-class-weighting"/>
     <w:p>
       <w:pPr>
         <w:pStyle w:val="Heading4"/>
@@ -9953,8 +9909,8 @@
         <w:t xml:space="preserve">. The weight tensor is moved to the logits’ device at loss time, so the code runs unchanged on CPU and GPU.</w:t>
       </w:r>
     </w:p>
-    <w:bookmarkEnd w:id="51"/>
-    <w:bookmarkStart w:id="52" w:name="early-stopping-on-macro-f1"/>
+    <w:bookmarkEnd w:id="54"/>
+    <w:bookmarkStart w:id="55" w:name="early-stopping-on-macro-f1"/>
     <w:p>
       <w:pPr>
         <w:pStyle w:val="Heading4"/>
@@ -10010,9 +9966,9 @@
         </w:pict>
       </w:r>
     </w:p>
-    <w:bookmarkEnd w:id="52"/>
-    <w:bookmarkEnd w:id="53"/>
-    <w:bookmarkStart w:id="58" w:name="evaluation-protocol"/>
+    <w:bookmarkEnd w:id="55"/>
+    <w:bookmarkEnd w:id="56"/>
+    <w:bookmarkStart w:id="61" w:name="evaluation-protocol"/>
     <w:p>
       <w:pPr>
         <w:pStyle w:val="Heading3"/>
@@ -10021,7 +9977,7 @@
         <w:t xml:space="preserve">3.8 Evaluation Protocol</w:t>
       </w:r>
     </w:p>
-    <w:bookmarkStart w:id="54" w:name="metrics"/>
+    <w:bookmarkStart w:id="57" w:name="metrics"/>
     <w:p>
       <w:pPr>
         <w:pStyle w:val="Heading4"/>
@@ -10289,8 +10245,8 @@
         <w:t xml:space="preserve">Accuracy is never the headline. On a 60/25/15 skewed test set a majority-class predictor scores 0.60 while learning nothing.</w:t>
       </w:r>
     </w:p>
-    <w:bookmarkEnd w:id="54"/>
-    <w:bookmarkStart w:id="55" w:name="slice-analyses"/>
+    <w:bookmarkEnd w:id="57"/>
+    <w:bookmarkStart w:id="58" w:name="slice-analyses"/>
     <w:p>
       <w:pPr>
         <w:pStyle w:val="Heading4"/>
@@ -10428,8 +10384,8 @@
         </w:tc>
       </w:tr>
     </w:tbl>
-    <w:bookmarkEnd w:id="55"/>
-    <w:bookmarkStart w:id="56" w:name="error-analysis"/>
+    <w:bookmarkEnd w:id="58"/>
+    <w:bookmarkStart w:id="59" w:name="error-analysis"/>
     <w:p>
       <w:pPr>
         <w:pStyle w:val="Heading4"/>
@@ -10467,8 +10423,8 @@
         <w:t xml:space="preserve">. These are read by hand. Patterns in the mistakes are the substance of the Discussion — not the headline metric.</w:t>
       </w:r>
     </w:p>
-    <w:bookmarkEnd w:id="56"/>
-    <w:bookmarkStart w:id="57" w:name="confusion-direction"/>
+    <w:bookmarkEnd w:id="59"/>
+    <w:bookmarkStart w:id="60" w:name="confusion-direction"/>
     <w:p>
       <w:pPr>
         <w:pStyle w:val="Heading4"/>
@@ -10516,9 +10472,9 @@
         </w:pict>
       </w:r>
     </w:p>
-    <w:bookmarkEnd w:id="57"/>
-    <w:bookmarkEnd w:id="58"/>
-    <w:bookmarkStart w:id="59" w:name="reproducibility"/>
+    <w:bookmarkEnd w:id="60"/>
+    <w:bookmarkEnd w:id="61"/>
+    <w:bookmarkStart w:id="62" w:name="reproducibility"/>
     <w:p>
       <w:pPr>
         <w:pStyle w:val="Heading3"/>
@@ -10812,8 +10768,8 @@
         </w:pict>
       </w:r>
     </w:p>
-    <w:bookmarkEnd w:id="59"/>
-    <w:bookmarkStart w:id="60" w:name="compute-environment"/>
+    <w:bookmarkEnd w:id="62"/>
+    <w:bookmarkStart w:id="63" w:name="compute-environment"/>
     <w:p>
       <w:pPr>
         <w:pStyle w:val="Heading3"/>
@@ -11012,8 +10968,8 @@
         </w:pict>
       </w:r>
     </w:p>
-    <w:bookmarkEnd w:id="60"/>
-    <w:bookmarkStart w:id="61" w:name="ethics-and-data-handling"/>
+    <w:bookmarkEnd w:id="63"/>
+    <w:bookmarkStart w:id="64" w:name="ethics-and-data-handling"/>
     <w:p>
       <w:pPr>
         <w:pStyle w:val="Heading3"/>
@@ -11159,8 +11115,8 @@
         </w:pict>
       </w:r>
     </w:p>
-    <w:bookmarkEnd w:id="61"/>
-    <w:bookmarkStart w:id="69" w:name="data-analysis"/>
+    <w:bookmarkEnd w:id="64"/>
+    <w:bookmarkStart w:id="72" w:name="data-analysis"/>
     <w:p>
       <w:pPr>
         <w:pStyle w:val="Heading3"/>
@@ -11169,7 +11125,7 @@
         <w:t xml:space="preserve">4.1 Data Analysis</w:t>
       </w:r>
     </w:p>
-    <w:bookmarkStart w:id="62" w:name="source-composition"/>
+    <w:bookmarkStart w:id="65" w:name="source-composition"/>
     <w:p>
       <w:pPr>
         <w:pStyle w:val="Heading4"/>
@@ -11625,8 +11581,8 @@
         </w:tc>
       </w:tr>
     </w:tbl>
-    <w:bookmarkEnd w:id="62"/>
-    <w:bookmarkStart w:id="66" w:name="label-distribution-and-split-integrity"/>
+    <w:bookmarkEnd w:id="65"/>
+    <w:bookmarkStart w:id="69" w:name="label-distribution-and-split-integrity"/>
     <w:p>
       <w:pPr>
         <w:pStyle w:val="Heading4"/>
@@ -11656,18 +11612,18 @@
           <wp:inline>
             <wp:extent cx="5334000" cy="3000375"/>
             <wp:effectExtent b="0" l="0" r="0" t="0"/>
-            <wp:docPr descr="Figure 4.1: Label distribution across splits" title="" id="64" name="Picture"/>
+            <wp:docPr descr="Figure 4.1: Label distribution across splits" title="" id="67" name="Picture"/>
             <a:graphic>
               <a:graphicData uri="http://schemas.openxmlformats.org/drawingml/2006/picture">
                 <pic:pic>
                   <pic:nvPicPr>
-                    <pic:cNvPr descr="../results/label_distribution.png" id="65" name="Picture"/>
+                    <pic:cNvPr descr="../results/label_distribution.png" id="68" name="Picture"/>
                     <pic:cNvPicPr>
                       <a:picLocks noChangeArrowheads="1" noChangeAspect="1"/>
                     </pic:cNvPicPr>
                   </pic:nvPicPr>
                   <pic:blipFill>
-                    <a:blip r:embed="rId63"/>
+                    <a:blip r:embed="rId66"/>
                     <a:stretch>
                       <a:fillRect/>
                     </a:stretch>
@@ -12020,8 +11976,8 @@
         <w:t xml:space="preserve">(0 text overlap across all splits), guaranteeing clean generalization measurement.</w:t>
       </w:r>
     </w:p>
-    <w:bookmarkEnd w:id="66"/>
-    <w:bookmarkStart w:id="67" w:name="filtering-attrition"/>
+    <w:bookmarkEnd w:id="69"/>
+    <w:bookmarkStart w:id="70" w:name="filtering-attrition"/>
     <w:p>
       <w:pPr>
         <w:pStyle w:val="Heading4"/>
@@ -12367,8 +12323,8 @@
         <w:t xml:space="preserve">was composed of only ~20 distinct comments repeated thousands of times; deduplication correctly preserved genuine lexical diversity without synthetic inflation.</w:t>
       </w:r>
     </w:p>
-    <w:bookmarkEnd w:id="67"/>
-    <w:bookmarkStart w:id="68" w:name="text-length-distribution"/>
+    <w:bookmarkEnd w:id="70"/>
+    <w:bookmarkStart w:id="71" w:name="text-length-distribution"/>
     <w:p>
       <w:pPr>
         <w:pStyle w:val="Heading4"/>
@@ -12599,9 +12555,9 @@
         </w:pict>
       </w:r>
     </w:p>
-    <w:bookmarkEnd w:id="68"/>
-    <w:bookmarkEnd w:id="69"/>
-    <w:bookmarkStart w:id="73" w:name="grammar-rule-mining-analysis-banglagec"/>
+    <w:bookmarkEnd w:id="71"/>
+    <w:bookmarkEnd w:id="72"/>
+    <w:bookmarkStart w:id="76" w:name="grammar-rule-mining-analysis-banglagec"/>
     <w:p>
       <w:pPr>
         <w:pStyle w:val="Heading3"/>
@@ -12622,7 +12578,7 @@
         <w:t xml:space="preserve">Produced by Notebook 01 §5.1.</w:t>
       </w:r>
     </w:p>
-    <w:bookmarkStart w:id="70" w:name="rule-yield"/>
+    <w:bookmarkStart w:id="73" w:name="rule-yield"/>
     <w:p>
       <w:pPr>
         <w:pStyle w:val="Heading4"/>
@@ -12813,8 +12769,8 @@
         </w:tc>
       </w:tr>
     </w:tbl>
-    <w:bookmarkEnd w:id="70"/>
-    <w:bookmarkStart w:id="71" w:name="rule-type-distribution"/>
+    <w:bookmarkEnd w:id="73"/>
+    <w:bookmarkStart w:id="74" w:name="rule-type-distribution"/>
     <w:p>
       <w:pPr>
         <w:pStyle w:val="Heading4"/>
@@ -13272,8 +13228,8 @@
         <w:t xml:space="preserve">and report why.</w:t>
       </w:r>
     </w:p>
-    <w:bookmarkEnd w:id="71"/>
-    <w:bookmarkStart w:id="72" w:name="ablation-does-the-rule-table-help"/>
+    <w:bookmarkEnd w:id="74"/>
+    <w:bookmarkStart w:id="75" w:name="ablation-does-the-rule-table-help"/>
     <w:p>
       <w:pPr>
         <w:pStyle w:val="Heading4"/>
@@ -13750,9 +13706,9 @@
         </w:pict>
       </w:r>
     </w:p>
-    <w:bookmarkEnd w:id="72"/>
-    <w:bookmarkEnd w:id="73"/>
-    <w:bookmarkStart w:id="74" w:name="lexicon-analysis-bangla-nlp-words"/>
+    <w:bookmarkEnd w:id="75"/>
+    <w:bookmarkEnd w:id="76"/>
+    <w:bookmarkStart w:id="77" w:name="lexicon-analysis-bangla-nlp-words"/>
     <w:p>
       <w:pPr>
         <w:pStyle w:val="Heading3"/>
@@ -14012,8 +13968,8 @@
         </w:pict>
       </w:r>
     </w:p>
-    <w:bookmarkEnd w:id="74"/>
-    <w:bookmarkStart w:id="76" w:name="X5bd696abf335b486e43852f874abe7738213260"/>
+    <w:bookmarkEnd w:id="77"/>
+    <w:bookmarkStart w:id="79" w:name="X5bd696abf335b486e43852f874abe7738213260"/>
     <w:p>
       <w:pPr>
         <w:pStyle w:val="Heading3"/>
@@ -14199,7 +14155,7 @@
         </w:tc>
       </w:tr>
     </w:tbl>
-    <w:bookmarkStart w:id="75" w:name="top-matched-tasks"/>
+    <w:bookmarkStart w:id="78" w:name="top-matched-tasks"/>
     <w:p>
       <w:pPr>
         <w:pStyle w:val="Heading4"/>
@@ -14577,9 +14533,9 @@
         </w:pict>
       </w:r>
     </w:p>
-    <w:bookmarkEnd w:id="75"/>
-    <w:bookmarkEnd w:id="76"/>
-    <w:bookmarkStart w:id="80" w:name="model-performance-analysis"/>
+    <w:bookmarkEnd w:id="78"/>
+    <w:bookmarkEnd w:id="79"/>
+    <w:bookmarkStart w:id="83" w:name="model-performance-analysis"/>
     <w:p>
       <w:pPr>
         <w:pStyle w:val="Heading3"/>
@@ -14588,7 +14544,7 @@
         <w:t xml:space="preserve">4.5 Model Performance Analysis</w:t>
       </w:r>
     </w:p>
-    <w:bookmarkStart w:id="77" w:name="overall-results"/>
+    <w:bookmarkStart w:id="80" w:name="overall-results"/>
     <w:p>
       <w:pPr>
         <w:pStyle w:val="Heading4"/>
@@ -15403,8 +15359,8 @@
         <w:t xml:space="preserve">), confirming strong correlation well above chance while appropriately penalizing imbalanced error modes.</w:t>
       </w:r>
     </w:p>
-    <w:bookmarkEnd w:id="77"/>
-    <w:bookmarkStart w:id="78" w:name="per-class-breakdown"/>
+    <w:bookmarkEnd w:id="80"/>
+    <w:bookmarkStart w:id="81" w:name="per-class-breakdown"/>
     <w:p>
       <w:pPr>
         <w:pStyle w:val="Heading4"/>
@@ -16296,8 +16252,8 @@
         <w:t xml:space="preserve">), confirming that critical customer complaints are reliably detected. As expected, neutral F1 is the lowest (0.0761 to 0.1429), as neutral reviews (rating = 3) are ambiguous and frequently absorbed into positive classifications.</w:t>
       </w:r>
     </w:p>
-    <w:bookmarkEnd w:id="78"/>
-    <w:bookmarkStart w:id="79" w:name="binary-2-class-results"/>
+    <w:bookmarkEnd w:id="81"/>
+    <w:bookmarkStart w:id="82" w:name="binary-2-class-results"/>
     <w:p>
       <w:pPr>
         <w:pStyle w:val="Heading4"/>
@@ -16653,9 +16609,9 @@
         </w:pict>
       </w:r>
     </w:p>
-    <w:bookmarkEnd w:id="79"/>
-    <w:bookmarkEnd w:id="80"/>
-    <w:bookmarkStart w:id="87" w:name="Xe8d096db4db477fd9f9f2b9b1bf968b2b593dff"/>
+    <w:bookmarkEnd w:id="82"/>
+    <w:bookmarkEnd w:id="83"/>
+    <w:bookmarkStart w:id="90" w:name="Xe8d096db4db477fd9f9f2b9b1bf968b2b593dff"/>
     <w:p>
       <w:pPr>
         <w:pStyle w:val="Heading3"/>
@@ -17016,67 +16972,12 @@
           <wp:inline>
             <wp:extent cx="5334000" cy="2963333"/>
             <wp:effectExtent b="0" l="0" r="0" t="0"/>
-            <wp:docPr descr="Figure 4.2: Macro-F1 comparison across models" title="" id="82" name="Picture"/>
+            <wp:docPr descr="Figure 4.2: Macro-F1 comparison across models" title="" id="85" name="Picture"/>
             <a:graphic>
               <a:graphicData uri="http://schemas.openxmlformats.org/drawingml/2006/picture">
                 <pic:pic>
                   <pic:nvPicPr>
-                    <pic:cNvPr descr="../results/bar_macro_f1.png" id="83" name="Picture"/>
-                    <pic:cNvPicPr>
-                      <a:picLocks noChangeArrowheads="1" noChangeAspect="1"/>
-                    </pic:cNvPicPr>
-                  </pic:nvPicPr>
-                  <pic:blipFill>
-                    <a:blip r:embed="rId81"/>
-                    <a:stretch>
-                      <a:fillRect/>
-                    </a:stretch>
-                  </pic:blipFill>
-                  <pic:spPr bwMode="auto">
-                    <a:xfrm>
-                      <a:off x="0" y="0"/>
-                      <a:ext cx="5334000" cy="2963333"/>
-                    </a:xfrm>
-                    <a:prstGeom prst="rect">
-                      <a:avLst/>
-                    </a:prstGeom>
-                    <a:noFill/>
-                    <a:ln w="9525">
-                      <a:noFill/>
-                      <a:headEnd/>
-                      <a:tailEnd/>
-                    </a:ln>
-                  </pic:spPr>
-                </pic:pic>
-              </a:graphicData>
-            </a:graphic>
-          </wp:inline>
-        </w:drawing>
-      </w:r>
-    </w:p>
-    <w:p>
-      <w:pPr>
-        <w:pStyle w:val="ImageCaption"/>
-      </w:pPr>
-      <w:r>
-        <w:t xml:space="preserve">Figure 4.2: Macro-F1 comparison across models</w:t>
-      </w:r>
-    </w:p>
-    <w:p>
-      <w:pPr>
-        <w:pStyle w:val="CaptionedFigure"/>
-      </w:pPr>
-      <w:r>
-        <w:drawing>
-          <wp:inline>
-            <wp:extent cx="5334000" cy="2963333"/>
-            <wp:effectExtent b="0" l="0" r="0" t="0"/>
-            <wp:docPr descr="Figure 4.3: Accuracy comparison across models" title="" id="85" name="Picture"/>
-            <a:graphic>
-              <a:graphicData uri="http://schemas.openxmlformats.org/drawingml/2006/picture">
-                <pic:pic>
-                  <pic:nvPicPr>
-                    <pic:cNvPr descr="../results/bar_accuracy.png" id="86" name="Picture"/>
+                    <pic:cNvPr descr="../results/bar_macro_f1.png" id="86" name="Picture"/>
                     <pic:cNvPicPr>
                       <a:picLocks noChangeArrowheads="1" noChangeAspect="1"/>
                     </pic:cNvPicPr>
@@ -17114,6 +17015,61 @@
         <w:pStyle w:val="ImageCaption"/>
       </w:pPr>
       <w:r>
+        <w:t xml:space="preserve">Figure 4.2: Macro-F1 comparison across models</w:t>
+      </w:r>
+    </w:p>
+    <w:p>
+      <w:pPr>
+        <w:pStyle w:val="CaptionedFigure"/>
+      </w:pPr>
+      <w:r>
+        <w:drawing>
+          <wp:inline>
+            <wp:extent cx="5334000" cy="2963333"/>
+            <wp:effectExtent b="0" l="0" r="0" t="0"/>
+            <wp:docPr descr="Figure 4.3: Accuracy comparison across models" title="" id="88" name="Picture"/>
+            <a:graphic>
+              <a:graphicData uri="http://schemas.openxmlformats.org/drawingml/2006/picture">
+                <pic:pic>
+                  <pic:nvPicPr>
+                    <pic:cNvPr descr="../results/bar_accuracy.png" id="89" name="Picture"/>
+                    <pic:cNvPicPr>
+                      <a:picLocks noChangeArrowheads="1" noChangeAspect="1"/>
+                    </pic:cNvPicPr>
+                  </pic:nvPicPr>
+                  <pic:blipFill>
+                    <a:blip r:embed="rId87"/>
+                    <a:stretch>
+                      <a:fillRect/>
+                    </a:stretch>
+                  </pic:blipFill>
+                  <pic:spPr bwMode="auto">
+                    <a:xfrm>
+                      <a:off x="0" y="0"/>
+                      <a:ext cx="5334000" cy="2963333"/>
+                    </a:xfrm>
+                    <a:prstGeom prst="rect">
+                      <a:avLst/>
+                    </a:prstGeom>
+                    <a:noFill/>
+                    <a:ln w="9525">
+                      <a:noFill/>
+                      <a:headEnd/>
+                      <a:tailEnd/>
+                    </a:ln>
+                  </pic:spPr>
+                </pic:pic>
+              </a:graphicData>
+            </a:graphic>
+          </wp:inline>
+        </w:drawing>
+      </w:r>
+    </w:p>
+    <w:p>
+      <w:pPr>
+        <w:pStyle w:val="ImageCaption"/>
+      </w:pPr>
+      <w:r>
         <w:t xml:space="preserve">Figure 4.3: Accuracy comparison across models</w:t>
       </w:r>
     </w:p>
@@ -17266,8 +17222,8 @@
         </w:pict>
       </w:r>
     </w:p>
-    <w:bookmarkEnd w:id="87"/>
-    <w:bookmarkStart w:id="91" w:name="slice-analysis"/>
+    <w:bookmarkEnd w:id="90"/>
+    <w:bookmarkStart w:id="94" w:name="slice-analysis"/>
     <w:p>
       <w:pPr>
         <w:pStyle w:val="Heading3"/>
@@ -17276,7 +17232,7 @@
         <w:t xml:space="preserve">4.7 Slice Analysis</w:t>
       </w:r>
     </w:p>
-    <w:bookmarkStart w:id="88" w:name="accuracy-by-source-platform"/>
+    <w:bookmarkStart w:id="91" w:name="accuracy-by-source-platform"/>
     <w:p>
       <w:pPr>
         <w:pStyle w:val="Heading4"/>
@@ -17579,8 +17535,8 @@
         <w:t xml:space="preserve">The spread of 17.26% highlights significant domain disparity: curated e-commerce comments in RevBangla achieve &gt;90% accuracy, whereas colloquial customer reviews on Daraz suffer from noisy ratings, dialect variation, and code-mixing.</w:t>
       </w:r>
     </w:p>
-    <w:bookmarkEnd w:id="88"/>
-    <w:bookmarkStart w:id="89" w:name="accuracy-by-negation-presence"/>
+    <w:bookmarkEnd w:id="91"/>
+    <w:bookmarkStart w:id="92" w:name="accuracy-by-negation-presence"/>
     <w:p>
       <w:pPr>
         <w:pStyle w:val="Heading4"/>
@@ -17977,8 +17933,8 @@
         <w:t xml:space="preserve">), meaning the forward tagging window captured only a portion of negation scopes. A backward negation window is recommended as a priority improvement.</w:t>
       </w:r>
     </w:p>
-    <w:bookmarkEnd w:id="89"/>
-    <w:bookmarkStart w:id="90" w:name="accuracy-by-comment-length"/>
+    <w:bookmarkEnd w:id="92"/>
+    <w:bookmarkStart w:id="93" w:name="accuracy-by-comment-length"/>
     <w:p>
       <w:pPr>
         <w:pStyle w:val="Heading4"/>
@@ -18326,9 +18282,9 @@
         </w:pict>
       </w:r>
     </w:p>
-    <w:bookmarkEnd w:id="90"/>
-    <w:bookmarkEnd w:id="91"/>
-    <w:bookmarkStart w:id="101" w:name="error-analysis-1"/>
+    <w:bookmarkEnd w:id="93"/>
+    <w:bookmarkEnd w:id="94"/>
+    <w:bookmarkStart w:id="104" w:name="error-analysis-1"/>
     <w:p>
       <w:pPr>
         <w:pStyle w:val="Heading3"/>
@@ -18371,7 +18327,7 @@
         <w:t xml:space="preserve">.</w:t>
       </w:r>
     </w:p>
-    <w:bookmarkStart w:id="95" w:name="confusion-matrix"/>
+    <w:bookmarkStart w:id="98" w:name="confusion-matrix"/>
     <w:p>
       <w:pPr>
         <w:pStyle w:val="Heading4"/>
@@ -18389,18 +18345,18 @@
           <wp:inline>
             <wp:extent cx="5334000" cy="2222499"/>
             <wp:effectExtent b="0" l="0" r="0" t="0"/>
-            <wp:docPr descr="Figure 4.4: BanglaBERT Confusion Matrix (Counts and Row-Normalised)" title="" id="93" name="Picture"/>
+            <wp:docPr descr="Figure 4.4: BanglaBERT Confusion Matrix (Counts and Row-Normalised)" title="" id="96" name="Picture"/>
             <a:graphic>
               <a:graphicData uri="http://schemas.openxmlformats.org/drawingml/2006/picture">
                 <pic:pic>
                   <pic:nvPicPr>
-                    <pic:cNvPr descr="../results/confusion_banglabert.png" id="94" name="Picture"/>
+                    <pic:cNvPr descr="../results/confusion_banglabert.png" id="97" name="Picture"/>
                     <pic:cNvPicPr>
                       <a:picLocks noChangeArrowheads="1" noChangeAspect="1"/>
                     </pic:cNvPicPr>
                   </pic:nvPicPr>
                   <pic:blipFill>
-                    <a:blip r:embed="rId92"/>
+                    <a:blip r:embed="rId95"/>
                     <a:stretch>
                       <a:fillRect/>
                     </a:stretch>
@@ -18773,8 +18729,8 @@
         <w:t xml:space="preserve">matrix, not the raw counts. Raw counts are dominated by class size and will always make the majority class look worst.</w:t>
       </w:r>
     </w:p>
-    <w:bookmarkEnd w:id="95"/>
-    <w:bookmarkStart w:id="96" w:name="qualitative-error-themes"/>
+    <w:bookmarkEnd w:id="98"/>
+    <w:bookmarkStart w:id="99" w:name="qualitative-error-themes"/>
     <w:p>
       <w:pPr>
         <w:pStyle w:val="Heading4"/>
@@ -19103,8 +19059,8 @@
         <w:t xml:space="preserve">In the examined error sample, 35–40% of apparent model errors stem from star-rating label noise (e.g. buyers writing scathing reviews while submitting 5-star ratings on Daraz). The model’s negative prediction in these cases was linguistically accurate, showing that label smoothing (0.05) is crucial for regularisation.</w:t>
       </w:r>
     </w:p>
-    <w:bookmarkEnd w:id="96"/>
-    <w:bookmarkStart w:id="100" w:name="roc-analysis"/>
+    <w:bookmarkEnd w:id="99"/>
+    <w:bookmarkStart w:id="103" w:name="roc-analysis"/>
     <w:p>
       <w:pPr>
         <w:pStyle w:val="Heading4"/>
@@ -19122,18 +19078,18 @@
           <wp:inline>
             <wp:extent cx="5334000" cy="3809999"/>
             <wp:effectExtent b="0" l="0" r="0" t="0"/>
-            <wp:docPr descr="Figure 4.5: BanglaBERT One-vs-Rest ROC Curves with Per-Class AUC" title="" id="98" name="Picture"/>
+            <wp:docPr descr="Figure 4.5: BanglaBERT One-vs-Rest ROC Curves with Per-Class AUC" title="" id="101" name="Picture"/>
             <a:graphic>
               <a:graphicData uri="http://schemas.openxmlformats.org/drawingml/2006/picture">
                 <pic:pic>
                   <pic:nvPicPr>
-                    <pic:cNvPr descr="../results/roc_banglabert.png" id="99" name="Picture"/>
+                    <pic:cNvPr descr="../results/roc_banglabert.png" id="102" name="Picture"/>
                     <pic:cNvPicPr>
                       <a:picLocks noChangeArrowheads="1" noChangeAspect="1"/>
                     </pic:cNvPicPr>
                   </pic:nvPicPr>
                   <pic:blipFill>
-                    <a:blip r:embed="rId97"/>
+                    <a:blip r:embed="rId100"/>
                     <a:stretch>
                       <a:fillRect/>
                     </a:stretch>
@@ -19397,9 +19353,9 @@
         </w:pict>
       </w:r>
     </w:p>
-    <w:bookmarkEnd w:id="100"/>
-    <w:bookmarkEnd w:id="101"/>
-    <w:bookmarkStart w:id="102" w:name="reproducibility-record"/>
+    <w:bookmarkEnd w:id="103"/>
+    <w:bookmarkEnd w:id="104"/>
+    <w:bookmarkStart w:id="105" w:name="reproducibility-record"/>
     <w:p>
       <w:pPr>
         <w:pStyle w:val="Heading3"/>
@@ -19929,8 +19885,8 @@
         </w:pict>
       </w:r>
     </w:p>
-    <w:bookmarkEnd w:id="102"/>
-    <w:bookmarkStart w:id="103" w:name="threats-to-validity"/>
+    <w:bookmarkEnd w:id="105"/>
+    <w:bookmarkStart w:id="106" w:name="threats-to-validity"/>
     <w:p>
       <w:pPr>
         <w:pStyle w:val="Heading3"/>
@@ -20441,8 +20397,8 @@
         </w:pict>
       </w:r>
     </w:p>
-    <w:bookmarkEnd w:id="103"/>
-    <w:bookmarkStart w:id="104" w:name="summary-of-required-runs"/>
+    <w:bookmarkEnd w:id="106"/>
+    <w:bookmarkStart w:id="107" w:name="summary-of-required-runs"/>
     <w:p>
       <w:pPr>
         <w:pStyle w:val="Heading3"/>
@@ -20712,8 +20668,8 @@
         </w:pict>
       </w:r>
     </w:p>
-    <w:bookmarkEnd w:id="104"/>
-    <w:bookmarkStart w:id="109" w:name="work-completed"/>
+    <w:bookmarkEnd w:id="107"/>
+    <w:bookmarkStart w:id="112" w:name="work-completed"/>
     <w:p>
       <w:pPr>
         <w:pStyle w:val="Heading3"/>
@@ -20730,7 +20686,7 @@
         <w:t xml:space="preserve">This project set out to build a Bangla sentiment analysis system on fine-tuned BERT models. Four things were delivered:</w:t>
       </w:r>
     </w:p>
-    <w:bookmarkStart w:id="105" w:name="a-reproducible-preprocessing-pipeline"/>
+    <w:bookmarkStart w:id="108" w:name="a-reproducible-preprocessing-pipeline"/>
     <w:p>
       <w:pPr>
         <w:pStyle w:val="Heading4"/>
@@ -20798,8 +20754,8 @@
         <w:t xml:space="preserve">) have pure-Python fallbacks, and an unresolvable source is skipped with a warning rather than aborting the run. This matters practically — Kaggle dataset schemas change without notice, and a pipeline that crashes on one upstream rename is not reproducible in any meaningful sense.</w:t>
       </w:r>
     </w:p>
-    <w:bookmarkEnd w:id="105"/>
-    <w:bookmarkStart w:id="106" w:name="X7e43f433f25a9d875977eaefdd956414f9624f9"/>
+    <w:bookmarkEnd w:id="108"/>
+    <w:bookmarkStart w:id="109" w:name="X7e43f433f25a9d875977eaefdd956414f9624f9"/>
     <w:p>
       <w:pPr>
         <w:pStyle w:val="Heading4"/>
@@ -21034,8 +20990,8 @@
         <w:t xml:space="preserve">The catalog use is the most novel of the three. Generating the literature review from a machine-readable index removes cherry-picking from the survey: the filter regex and the catalog version are both recorded, so the selection of prior work is auditable.</w:t>
       </w:r>
     </w:p>
-    <w:bookmarkEnd w:id="106"/>
-    <w:bookmarkStart w:id="107" w:name="a-fair-multi-model-comparison-harness"/>
+    <w:bookmarkEnd w:id="109"/>
+    <w:bookmarkStart w:id="110" w:name="a-fair-multi-model-comparison-harness"/>
     <w:p>
       <w:pPr>
         <w:pStyle w:val="Heading4"/>
@@ -21179,8 +21135,8 @@
         <w:t xml:space="preserve">— star-rating-derived labels are noisy proxies for human judgement.</w:t>
       </w:r>
     </w:p>
-    <w:bookmarkEnd w:id="107"/>
-    <w:bookmarkStart w:id="108" w:name="X5112dd8f593b3d81dacd288c7efddbcec3885ef"/>
+    <w:bookmarkEnd w:id="110"/>
+    <w:bookmarkStart w:id="111" w:name="X5112dd8f593b3d81dacd288c7efddbcec3885ef"/>
     <w:p>
       <w:pPr>
         <w:pStyle w:val="Heading4"/>
@@ -21308,9 +21264,9 @@
         </w:pict>
       </w:r>
     </w:p>
-    <w:bookmarkEnd w:id="108"/>
-    <w:bookmarkEnd w:id="109"/>
-    <w:bookmarkStart w:id="116" w:name="findings"/>
+    <w:bookmarkEnd w:id="111"/>
+    <w:bookmarkEnd w:id="112"/>
+    <w:bookmarkStart w:id="119" w:name="findings"/>
     <w:p>
       <w:pPr>
         <w:pStyle w:val="Heading3"/>
@@ -21319,7 +21275,7 @@
         <w:t xml:space="preserve">5.2 Findings</w:t>
       </w:r>
     </w:p>
-    <w:bookmarkStart w:id="110" w:name="X301d03ea537db25d902ad0db8c475bcbc4e556c"/>
+    <w:bookmarkStart w:id="113" w:name="X301d03ea537db25d902ad0db8c475bcbc4e556c"/>
     <w:p>
       <w:pPr>
         <w:pStyle w:val="Heading4"/>
@@ -21756,8 +21712,8 @@
         <w:t xml:space="preserve">, making the task effectively near-binary and collapsing every neutral metric into noise (neutral F1 0.076–0.143); and all five transformers are majority-biased (positive recall 0.759–0.827 against neutral recall 0.238–0.476).</w:t>
       </w:r>
     </w:p>
-    <w:bookmarkEnd w:id="110"/>
-    <w:bookmarkStart w:id="111" w:name="X6d20584dbf562fb6b65e5a9ae62a97b02d593f2"/>
+    <w:bookmarkEnd w:id="113"/>
+    <w:bookmarkStart w:id="114" w:name="X6d20584dbf562fb6b65e5a9ae62a97b02d593f2"/>
     <w:p>
       <w:pPr>
         <w:pStyle w:val="Heading4"/>
@@ -21921,8 +21877,8 @@
         <w:t xml:space="preserve">) outperforms the best 1-epoch transformer by 2.76 percentage points in macro-F1 (0.6341 vs. 0.6065) and in accuracy (0.8854 vs. 0.8278). Subword character n-grams (2–5 characters) paired with class-weighted logistic regression excel on noisy, orthographically irregular Bangla reviews without overfitting, setting a competitive performance ceiling that transformers require substantial hyperparameter tuning and multi-epoch compute to match.</w:t>
       </w:r>
     </w:p>
-    <w:bookmarkEnd w:id="111"/>
-    <w:bookmarkStart w:id="112" w:name="did-banglagec-contribute"/>
+    <w:bookmarkEnd w:id="114"/>
+    <w:bookmarkStart w:id="115" w:name="did-banglagec-contribute"/>
     <w:p>
       <w:pPr>
         <w:pStyle w:val="Heading4"/>
@@ -22053,8 +22009,8 @@
         <w:t xml:space="preserve">The ablation reveals a negative delta (−0.0243 Macro-F1, −0.0334 Accuracy). Normalizing informal Bangla words through parallel GEC substitution rules tends to smooth away colloquial and emphatic dialect forms that carry strong sentiment signals in user reviews. While BanglaGEC successfully provides a 96,383-token well-formed vocabulary and an auditable linguistic baseline, unconstrained grammatical normalization should be applied judiciously in sentiment tasks to avoid eroding affective nuance.</w:t>
       </w:r>
     </w:p>
-    <w:bookmarkEnd w:id="112"/>
-    <w:bookmarkStart w:id="113" w:name="did-negation-scope-tagging-help"/>
+    <w:bookmarkEnd w:id="115"/>
+    <w:bookmarkStart w:id="116" w:name="did-negation-scope-tagging-help"/>
     <w:p>
       <w:pPr>
         <w:pStyle w:val="Heading4"/>
@@ -22242,8 +22198,8 @@
         <w:t xml:space="preserve">The test set contains 13.40% negation-tagged rows (186 rows), well above the 5% statistical power floor. Both BanglaBERT and the TF-IDF baseline exhibit a noticeable negation deficit (~15–20%), reflecting the difficulty of polarity inversion in colloquial Bangla review text. Because Bangla primarily places the negator after the verb, moving to a backward negation window represents a clear future improvement.</w:t>
       </w:r>
     </w:p>
-    <w:bookmarkEnd w:id="113"/>
-    <w:bookmarkStart w:id="114" w:name="generalisation-across-platforms"/>
+    <w:bookmarkEnd w:id="116"/>
+    <w:bookmarkStart w:id="117" w:name="generalisation-across-platforms"/>
     <w:p>
       <w:pPr>
         <w:pStyle w:val="Heading4"/>
@@ -22392,8 +22348,8 @@
         <w:t xml:space="preserve">The 17.26% cross-platform spread reflects the noisy star ratings and code-mixing present in the Daraz reviews relative to the cleaner curated text in RevBangla.</w:t>
       </w:r>
     </w:p>
-    <w:bookmarkEnd w:id="114"/>
-    <w:bookmarkStart w:id="115" w:name="dominant-error-mode"/>
+    <w:bookmarkEnd w:id="117"/>
+    <w:bookmarkStart w:id="118" w:name="dominant-error-mode"/>
     <w:p>
       <w:pPr>
         <w:pStyle w:val="Heading4"/>
@@ -22565,9 +22521,9 @@
         </w:pict>
       </w:r>
     </w:p>
-    <w:bookmarkEnd w:id="115"/>
-    <w:bookmarkEnd w:id="116"/>
-    <w:bookmarkStart w:id="117" w:name="limitations"/>
+    <w:bookmarkEnd w:id="118"/>
+    <w:bookmarkEnd w:id="119"/>
+    <w:bookmarkStart w:id="120" w:name="limitations"/>
     <w:p>
       <w:pPr>
         <w:pStyle w:val="Heading3"/>
@@ -22812,8 +22768,8 @@
         </w:pict>
       </w:r>
     </w:p>
-    <w:bookmarkEnd w:id="117"/>
-    <w:bookmarkStart w:id="118" w:name="future-work"/>
+    <w:bookmarkEnd w:id="120"/>
+    <w:bookmarkStart w:id="121" w:name="future-work"/>
     <w:p>
       <w:pPr>
         <w:pStyle w:val="Heading3"/>
@@ -23354,8 +23310,8 @@
         </w:pict>
       </w:r>
     </w:p>
-    <w:bookmarkEnd w:id="118"/>
-    <w:bookmarkStart w:id="119" w:name="closing-remark"/>
+    <w:bookmarkEnd w:id="121"/>
+    <w:bookmarkStart w:id="122" w:name="closing-remark"/>
     <w:p>
       <w:pPr>
         <w:pStyle w:val="Heading3"/>
@@ -23504,9 +23460,9 @@
         </w:pict>
       </w:r>
     </w:p>
-    <w:bookmarkEnd w:id="119"/>
-    <w:bookmarkEnd w:id="120"/>
-    <w:bookmarkStart w:id="148" w:name="X32da77d8b8ff5bc7e908ac842c0ecce1cc371b0"/>
+    <w:bookmarkEnd w:id="122"/>
+    <w:bookmarkEnd w:id="123"/>
+    <w:bookmarkStart w:id="151" w:name="X32da77d8b8ff5bc7e908ac842c0ecce1cc371b0"/>
     <w:p>
       <w:pPr>
         <w:pStyle w:val="Heading2"/>
@@ -23544,7 +23500,7 @@
         <w:t xml:space="preserve">. Regenerate before submission.</w:t>
       </w:r>
     </w:p>
-    <w:bookmarkStart w:id="147" w:name="Xdb321718ba9f2125c82b04e87ae7e5bb56d080f"/>
+    <w:bookmarkStart w:id="150" w:name="Xdb321718ba9f2125c82b04e87ae7e5bb56d080f"/>
     <w:p>
       <w:pPr>
         <w:pStyle w:val="Heading4"/>
@@ -23568,7 +23524,7 @@
         <w:t xml:space="preserve">(166 matched entries)</w:t>
       </w:r>
     </w:p>
-    <w:bookmarkStart w:id="131" w:name="dataset-14"/>
+    <w:bookmarkStart w:id="134" w:name="dataset-14"/>
     <w:p>
       <w:pPr>
         <w:pStyle w:val="Heading5"/>
@@ -23702,192 +23658,6 @@
             <w:pPr>
               <w:pStyle w:val="Compact"/>
             </w:pPr>
-            <w:hyperlink r:id="rId121">
-              <w:r>
-                <w:rPr>
-                  <w:rStyle w:val="Hyperlink"/>
-                </w:rPr>
-                <w:t xml:space="preserve">link</w:t>
-              </w:r>
-            </w:hyperlink>
-          </w:p>
-        </w:tc>
-      </w:tr>
-      <w:tr>
-        <w:tc>
-          <w:tcPr/>
-          <w:p>
-            <w:pPr>
-              <w:pStyle w:val="Compact"/>
-            </w:pPr>
-            <w:r>
-              <w:t xml:space="preserve">BanglaSarc3</w:t>
-            </w:r>
-          </w:p>
-        </w:tc>
-        <w:tc>
-          <w:tcPr/>
-          <w:p>
-            <w:pPr>
-              <w:pStyle w:val="Compact"/>
-            </w:pPr>
-            <w:r>
-              <w:t xml:space="preserve">2025</w:t>
-            </w:r>
-          </w:p>
-        </w:tc>
-        <w:tc>
-          <w:tcPr/>
-          <w:p>
-            <w:pPr>
-              <w:pStyle w:val="Compact"/>
-            </w:pPr>
-            <w:r>
-              <w:t xml:space="preserve">sentiment</w:t>
-            </w:r>
-          </w:p>
-        </w:tc>
-        <w:tc>
-          <w:tcPr/>
-          <w:p>
-            <w:pPr>
-              <w:pStyle w:val="Compact"/>
-            </w:pPr>
-            <w:r>
-              <w:t xml:space="preserve">BanglaSarc3 (Data in Brief 2025)</w:t>
-            </w:r>
-          </w:p>
-        </w:tc>
-        <w:tc>
-          <w:tcPr/>
-          <w:p>
-            <w:pPr>
-              <w:pStyle w:val="Compact"/>
-            </w:pPr>
-            <w:hyperlink r:id="rId122">
-              <w:r>
-                <w:rPr>
-                  <w:rStyle w:val="Hyperlink"/>
-                </w:rPr>
-                <w:t xml:space="preserve">link</w:t>
-              </w:r>
-            </w:hyperlink>
-          </w:p>
-        </w:tc>
-      </w:tr>
-      <w:tr>
-        <w:tc>
-          <w:tcPr/>
-          <w:p>
-            <w:pPr>
-              <w:pStyle w:val="Compact"/>
-            </w:pPr>
-            <w:r>
-              <w:t xml:space="preserve">EmoMix-3L</w:t>
-            </w:r>
-          </w:p>
-        </w:tc>
-        <w:tc>
-          <w:tcPr/>
-          <w:p>
-            <w:pPr>
-              <w:pStyle w:val="Compact"/>
-            </w:pPr>
-            <w:r>
-              <w:t xml:space="preserve">2024</w:t>
-            </w:r>
-          </w:p>
-        </w:tc>
-        <w:tc>
-          <w:tcPr/>
-          <w:p>
-            <w:pPr>
-              <w:pStyle w:val="Compact"/>
-            </w:pPr>
-            <w:r>
-              <w:t xml:space="preserve">sentiment</w:t>
-            </w:r>
-          </w:p>
-        </w:tc>
-        <w:tc>
-          <w:tcPr/>
-          <w:p>
-            <w:pPr>
-              <w:pStyle w:val="Compact"/>
-            </w:pPr>
-            <w:r>
-              <w:t xml:space="preserve">EmoMix-3L (WILDRE 2024)</w:t>
-            </w:r>
-          </w:p>
-        </w:tc>
-        <w:tc>
-          <w:tcPr/>
-          <w:p>
-            <w:pPr>
-              <w:pStyle w:val="Compact"/>
-            </w:pPr>
-            <w:hyperlink r:id="rId123">
-              <w:r>
-                <w:rPr>
-                  <w:rStyle w:val="Hyperlink"/>
-                </w:rPr>
-                <w:t xml:space="preserve">link</w:t>
-              </w:r>
-            </w:hyperlink>
-          </w:p>
-        </w:tc>
-      </w:tr>
-      <w:tr>
-        <w:tc>
-          <w:tcPr/>
-          <w:p>
-            <w:pPr>
-              <w:pStyle w:val="Compact"/>
-            </w:pPr>
-            <w:r>
-              <w:t xml:space="preserve">BnSentMix</w:t>
-            </w:r>
-          </w:p>
-        </w:tc>
-        <w:tc>
-          <w:tcPr/>
-          <w:p>
-            <w:pPr>
-              <w:pStyle w:val="Compact"/>
-            </w:pPr>
-            <w:r>
-              <w:t xml:space="preserve">2024</w:t>
-            </w:r>
-          </w:p>
-        </w:tc>
-        <w:tc>
-          <w:tcPr/>
-          <w:p>
-            <w:pPr>
-              <w:pStyle w:val="Compact"/>
-            </w:pPr>
-            <w:r>
-              <w:t xml:space="preserve">sentiment</w:t>
-            </w:r>
-          </w:p>
-        </w:tc>
-        <w:tc>
-          <w:tcPr/>
-          <w:p>
-            <w:pPr>
-              <w:pStyle w:val="Compact"/>
-            </w:pPr>
-            <w:r>
-              <w:t xml:space="preserve">BnSentMix (LoResLM 2025)</w:t>
-            </w:r>
-          </w:p>
-        </w:tc>
-        <w:tc>
-          <w:tcPr/>
-          <w:p>
-            <w:pPr>
-              <w:pStyle w:val="Compact"/>
-            </w:pPr>
             <w:hyperlink r:id="rId124">
               <w:r>
                 <w:rPr>
@@ -23907,18 +23677,18 @@
               <w:pStyle w:val="Compact"/>
             </w:pPr>
             <w:r>
-              <w:t xml:space="preserve">Motamot</w:t>
-            </w:r>
-          </w:p>
-        </w:tc>
-        <w:tc>
-          <w:tcPr/>
-          <w:p>
-            <w:pPr>
-              <w:pStyle w:val="Compact"/>
-            </w:pPr>
-            <w:r>
-              <w:t xml:space="preserve">2024</w:t>
+              <w:t xml:space="preserve">BanglaSarc3</w:t>
+            </w:r>
+          </w:p>
+        </w:tc>
+        <w:tc>
+          <w:tcPr/>
+          <w:p>
+            <w:pPr>
+              <w:pStyle w:val="Compact"/>
+            </w:pPr>
+            <w:r>
+              <w:t xml:space="preserve">2025</w:t>
             </w:r>
           </w:p>
         </w:tc>
@@ -23940,7 +23710,7 @@
               <w:pStyle w:val="Compact"/>
             </w:pPr>
             <w:r>
-              <w:t xml:space="preserve">Motamot (2024)</w:t>
+              <w:t xml:space="preserve">BanglaSarc3 (Data in Brief 2025)</w:t>
             </w:r>
           </w:p>
         </w:tc>
@@ -23969,18 +23739,18 @@
               <w:pStyle w:val="Compact"/>
             </w:pPr>
             <w:r>
-              <w:t xml:space="preserve">SentMix-3L</w:t>
-            </w:r>
-          </w:p>
-        </w:tc>
-        <w:tc>
-          <w:tcPr/>
-          <w:p>
-            <w:pPr>
-              <w:pStyle w:val="Compact"/>
-            </w:pPr>
-            <w:r>
-              <w:t xml:space="preserve">2023</w:t>
+              <w:t xml:space="preserve">EmoMix-3L</w:t>
+            </w:r>
+          </w:p>
+        </w:tc>
+        <w:tc>
+          <w:tcPr/>
+          <w:p>
+            <w:pPr>
+              <w:pStyle w:val="Compact"/>
+            </w:pPr>
+            <w:r>
+              <w:t xml:space="preserve">2024</w:t>
             </w:r>
           </w:p>
         </w:tc>
@@ -24002,7 +23772,7 @@
               <w:pStyle w:val="Compact"/>
             </w:pPr>
             <w:r>
-              <w:t xml:space="preserve">SentMix-3L (SEALP 2023)</w:t>
+              <w:t xml:space="preserve">EmoMix-3L (WILDRE 2024)</w:t>
             </w:r>
           </w:p>
         </w:tc>
@@ -24031,40 +23801,40 @@
               <w:pStyle w:val="Compact"/>
             </w:pPr>
             <w:r>
-              <w:t xml:space="preserve">BANSpEmo</w:t>
-            </w:r>
-          </w:p>
-        </w:tc>
-        <w:tc>
-          <w:tcPr/>
-          <w:p>
-            <w:pPr>
-              <w:pStyle w:val="Compact"/>
-            </w:pPr>
-            <w:r>
-              <w:t xml:space="preserve">2023</w:t>
-            </w:r>
-          </w:p>
-        </w:tc>
-        <w:tc>
-          <w:tcPr/>
-          <w:p>
-            <w:pPr>
-              <w:pStyle w:val="Compact"/>
-            </w:pPr>
-            <w:r>
-              <w:t xml:space="preserve">ser</w:t>
-            </w:r>
-          </w:p>
-        </w:tc>
-        <w:tc>
-          <w:tcPr/>
-          <w:p>
-            <w:pPr>
-              <w:pStyle w:val="Compact"/>
-            </w:pPr>
-            <w:r>
-              <w:t xml:space="preserve">Sultana et al. / Mendeley Data</w:t>
+              <w:t xml:space="preserve">BnSentMix</w:t>
+            </w:r>
+          </w:p>
+        </w:tc>
+        <w:tc>
+          <w:tcPr/>
+          <w:p>
+            <w:pPr>
+              <w:pStyle w:val="Compact"/>
+            </w:pPr>
+            <w:r>
+              <w:t xml:space="preserve">2024</w:t>
+            </w:r>
+          </w:p>
+        </w:tc>
+        <w:tc>
+          <w:tcPr/>
+          <w:p>
+            <w:pPr>
+              <w:pStyle w:val="Compact"/>
+            </w:pPr>
+            <w:r>
+              <w:t xml:space="preserve">sentiment</w:t>
+            </w:r>
+          </w:p>
+        </w:tc>
+        <w:tc>
+          <w:tcPr/>
+          <w:p>
+            <w:pPr>
+              <w:pStyle w:val="Compact"/>
+            </w:pPr>
+            <w:r>
+              <w:t xml:space="preserve">BnSentMix (LoResLM 2025)</w:t>
             </w:r>
           </w:p>
         </w:tc>
@@ -24093,40 +23863,40 @@
               <w:pStyle w:val="Compact"/>
             </w:pPr>
             <w:r>
-              <w:t xml:space="preserve">KBES (KUET Bangla Emotional Speech)</w:t>
-            </w:r>
-          </w:p>
-        </w:tc>
-        <w:tc>
-          <w:tcPr/>
-          <w:p>
-            <w:pPr>
-              <w:pStyle w:val="Compact"/>
-            </w:pPr>
-            <w:r>
-              <w:t xml:space="preserve">2023</w:t>
-            </w:r>
-          </w:p>
-        </w:tc>
-        <w:tc>
-          <w:tcPr/>
-          <w:p>
-            <w:pPr>
-              <w:pStyle w:val="Compact"/>
-            </w:pPr>
-            <w:r>
-              <w:t xml:space="preserve">ser</w:t>
-            </w:r>
-          </w:p>
-        </w:tc>
-        <w:tc>
-          <w:tcPr/>
-          <w:p>
-            <w:pPr>
-              <w:pStyle w:val="Compact"/>
-            </w:pPr>
-            <w:r>
-              <w:t xml:space="preserve">KBES (Data in Brief 2023)</w:t>
+              <w:t xml:space="preserve">Motamot</w:t>
+            </w:r>
+          </w:p>
+        </w:tc>
+        <w:tc>
+          <w:tcPr/>
+          <w:p>
+            <w:pPr>
+              <w:pStyle w:val="Compact"/>
+            </w:pPr>
+            <w:r>
+              <w:t xml:space="preserve">2024</w:t>
+            </w:r>
+          </w:p>
+        </w:tc>
+        <w:tc>
+          <w:tcPr/>
+          <w:p>
+            <w:pPr>
+              <w:pStyle w:val="Compact"/>
+            </w:pPr>
+            <w:r>
+              <w:t xml:space="preserve">sentiment</w:t>
+            </w:r>
+          </w:p>
+        </w:tc>
+        <w:tc>
+          <w:tcPr/>
+          <w:p>
+            <w:pPr>
+              <w:pStyle w:val="Compact"/>
+            </w:pPr>
+            <w:r>
+              <w:t xml:space="preserve">Motamot (2024)</w:t>
             </w:r>
           </w:p>
         </w:tc>
@@ -24155,7 +23925,7 @@
               <w:pStyle w:val="Compact"/>
             </w:pPr>
             <w:r>
-              <w:t xml:space="preserve">BanglaBook</w:t>
+              <w:t xml:space="preserve">SentMix-3L</w:t>
             </w:r>
           </w:p>
         </w:tc>
@@ -24188,7 +23958,7 @@
               <w:pStyle w:val="Compact"/>
             </w:pPr>
             <w:r>
-              <w:t xml:space="preserve">BanglaBook (Findings ACL 2023)</w:t>
+              <w:t xml:space="preserve">SentMix-3L (SEALP 2023)</w:t>
             </w:r>
           </w:p>
         </w:tc>
@@ -24217,18 +23987,18 @@
               <w:pStyle w:val="Compact"/>
             </w:pPr>
             <w:r>
-              <w:t xml:space="preserve">BanglaSER</w:t>
-            </w:r>
-          </w:p>
-        </w:tc>
-        <w:tc>
-          <w:tcPr/>
-          <w:p>
-            <w:pPr>
-              <w:pStyle w:val="Compact"/>
-            </w:pPr>
-            <w:r>
-              <w:t xml:space="preserve">2022</w:t>
+              <w:t xml:space="preserve">BANSpEmo</w:t>
+            </w:r>
+          </w:p>
+        </w:tc>
+        <w:tc>
+          <w:tcPr/>
+          <w:p>
+            <w:pPr>
+              <w:pStyle w:val="Compact"/>
+            </w:pPr>
+            <w:r>
+              <w:t xml:space="preserve">2023</w:t>
             </w:r>
           </w:p>
         </w:tc>
@@ -24250,7 +24020,7 @@
               <w:pStyle w:val="Compact"/>
             </w:pPr>
             <w:r>
-              <w:t xml:space="preserve">BanglaSER (Data in Brief 2022)</w:t>
+              <w:t xml:space="preserve">Sultana et al. / Mendeley Data</w:t>
             </w:r>
           </w:p>
         </w:tc>
@@ -24271,9 +24041,195 @@
           </w:p>
         </w:tc>
       </w:tr>
+      <w:tr>
+        <w:tc>
+          <w:tcPr/>
+          <w:p>
+            <w:pPr>
+              <w:pStyle w:val="Compact"/>
+            </w:pPr>
+            <w:r>
+              <w:t xml:space="preserve">KBES (KUET Bangla Emotional Speech)</w:t>
+            </w:r>
+          </w:p>
+        </w:tc>
+        <w:tc>
+          <w:tcPr/>
+          <w:p>
+            <w:pPr>
+              <w:pStyle w:val="Compact"/>
+            </w:pPr>
+            <w:r>
+              <w:t xml:space="preserve">2023</w:t>
+            </w:r>
+          </w:p>
+        </w:tc>
+        <w:tc>
+          <w:tcPr/>
+          <w:p>
+            <w:pPr>
+              <w:pStyle w:val="Compact"/>
+            </w:pPr>
+            <w:r>
+              <w:t xml:space="preserve">ser</w:t>
+            </w:r>
+          </w:p>
+        </w:tc>
+        <w:tc>
+          <w:tcPr/>
+          <w:p>
+            <w:pPr>
+              <w:pStyle w:val="Compact"/>
+            </w:pPr>
+            <w:r>
+              <w:t xml:space="preserve">KBES (Data in Brief 2023)</w:t>
+            </w:r>
+          </w:p>
+        </w:tc>
+        <w:tc>
+          <w:tcPr/>
+          <w:p>
+            <w:pPr>
+              <w:pStyle w:val="Compact"/>
+            </w:pPr>
+            <w:hyperlink r:id="rId131">
+              <w:r>
+                <w:rPr>
+                  <w:rStyle w:val="Hyperlink"/>
+                </w:rPr>
+                <w:t xml:space="preserve">link</w:t>
+              </w:r>
+            </w:hyperlink>
+          </w:p>
+        </w:tc>
+      </w:tr>
+      <w:tr>
+        <w:tc>
+          <w:tcPr/>
+          <w:p>
+            <w:pPr>
+              <w:pStyle w:val="Compact"/>
+            </w:pPr>
+            <w:r>
+              <w:t xml:space="preserve">BanglaBook</w:t>
+            </w:r>
+          </w:p>
+        </w:tc>
+        <w:tc>
+          <w:tcPr/>
+          <w:p>
+            <w:pPr>
+              <w:pStyle w:val="Compact"/>
+            </w:pPr>
+            <w:r>
+              <w:t xml:space="preserve">2023</w:t>
+            </w:r>
+          </w:p>
+        </w:tc>
+        <w:tc>
+          <w:tcPr/>
+          <w:p>
+            <w:pPr>
+              <w:pStyle w:val="Compact"/>
+            </w:pPr>
+            <w:r>
+              <w:t xml:space="preserve">sentiment</w:t>
+            </w:r>
+          </w:p>
+        </w:tc>
+        <w:tc>
+          <w:tcPr/>
+          <w:p>
+            <w:pPr>
+              <w:pStyle w:val="Compact"/>
+            </w:pPr>
+            <w:r>
+              <w:t xml:space="preserve">BanglaBook (Findings ACL 2023)</w:t>
+            </w:r>
+          </w:p>
+        </w:tc>
+        <w:tc>
+          <w:tcPr/>
+          <w:p>
+            <w:pPr>
+              <w:pStyle w:val="Compact"/>
+            </w:pPr>
+            <w:hyperlink r:id="rId132">
+              <w:r>
+                <w:rPr>
+                  <w:rStyle w:val="Hyperlink"/>
+                </w:rPr>
+                <w:t xml:space="preserve">link</w:t>
+              </w:r>
+            </w:hyperlink>
+          </w:p>
+        </w:tc>
+      </w:tr>
+      <w:tr>
+        <w:tc>
+          <w:tcPr/>
+          <w:p>
+            <w:pPr>
+              <w:pStyle w:val="Compact"/>
+            </w:pPr>
+            <w:r>
+              <w:t xml:space="preserve">BanglaSER</w:t>
+            </w:r>
+          </w:p>
+        </w:tc>
+        <w:tc>
+          <w:tcPr/>
+          <w:p>
+            <w:pPr>
+              <w:pStyle w:val="Compact"/>
+            </w:pPr>
+            <w:r>
+              <w:t xml:space="preserve">2022</w:t>
+            </w:r>
+          </w:p>
+        </w:tc>
+        <w:tc>
+          <w:tcPr/>
+          <w:p>
+            <w:pPr>
+              <w:pStyle w:val="Compact"/>
+            </w:pPr>
+            <w:r>
+              <w:t xml:space="preserve">ser</w:t>
+            </w:r>
+          </w:p>
+        </w:tc>
+        <w:tc>
+          <w:tcPr/>
+          <w:p>
+            <w:pPr>
+              <w:pStyle w:val="Compact"/>
+            </w:pPr>
+            <w:r>
+              <w:t xml:space="preserve">BanglaSER (Data in Brief 2022)</w:t>
+            </w:r>
+          </w:p>
+        </w:tc>
+        <w:tc>
+          <w:tcPr/>
+          <w:p>
+            <w:pPr>
+              <w:pStyle w:val="Compact"/>
+            </w:pPr>
+            <w:hyperlink r:id="rId133">
+              <w:r>
+                <w:rPr>
+                  <w:rStyle w:val="Hyperlink"/>
+                </w:rPr>
+                <w:t xml:space="preserve">link</w:t>
+              </w:r>
+            </w:hyperlink>
+          </w:p>
+        </w:tc>
+      </w:tr>
     </w:tbl>
-    <w:bookmarkEnd w:id="131"/>
-    <w:bookmarkStart w:id="133" w:name="model-1"/>
+    <w:bookmarkEnd w:id="134"/>
+    <w:bookmarkStart w:id="136" w:name="model-1"/>
     <w:p>
       <w:pPr>
         <w:pStyle w:val="Heading5"/>
@@ -24407,7 +24363,7 @@
             <w:pPr>
               <w:pStyle w:val="Compact"/>
             </w:pPr>
-            <w:hyperlink r:id="rId132">
+            <w:hyperlink r:id="rId135">
               <w:r>
                 <w:rPr>
                   <w:rStyle w:val="Hyperlink"/>
@@ -24419,8 +24375,8 @@
         </w:tc>
       </w:tr>
     </w:tbl>
-    <w:bookmarkEnd w:id="133"/>
-    <w:bookmarkStart w:id="144" w:name="paper-150"/>
+    <w:bookmarkEnd w:id="136"/>
+    <w:bookmarkStart w:id="147" w:name="paper-150"/>
     <w:p>
       <w:pPr>
         <w:pStyle w:val="Heading5"/>
@@ -24554,192 +24510,6 @@
             <w:pPr>
               <w:pStyle w:val="Compact"/>
             </w:pPr>
-            <w:hyperlink r:id="rId134">
-              <w:r>
-                <w:rPr>
-                  <w:rStyle w:val="Hyperlink"/>
-                </w:rPr>
-                <w:t xml:space="preserve">link</w:t>
-              </w:r>
-            </w:hyperlink>
-          </w:p>
-        </w:tc>
-      </w:tr>
-      <w:tr>
-        <w:tc>
-          <w:tcPr/>
-          <w:p>
-            <w:pPr>
-              <w:pStyle w:val="Compact"/>
-            </w:pPr>
-            <w:r>
-              <w:t xml:space="preserve">A Novel Dual-Order Hybrid BiLSTM–BiGRU Ensemble Model for English-Bengali Code-Mixed Sentiment Analysis</w:t>
-            </w:r>
-          </w:p>
-        </w:tc>
-        <w:tc>
-          <w:tcPr/>
-          <w:p>
-            <w:pPr>
-              <w:pStyle w:val="Compact"/>
-            </w:pPr>
-            <w:r>
-              <w:t xml:space="preserve">2026</w:t>
-            </w:r>
-          </w:p>
-        </w:tc>
-        <w:tc>
-          <w:tcPr/>
-          <w:p>
-            <w:pPr>
-              <w:pStyle w:val="Compact"/>
-            </w:pPr>
-            <w:r>
-              <w:t xml:space="preserve">sentiment</w:t>
-            </w:r>
-          </w:p>
-        </w:tc>
-        <w:tc>
-          <w:tcPr/>
-          <w:p>
-            <w:pPr>
-              <w:pStyle w:val="Compact"/>
-            </w:pPr>
-            <w:r>
-              <w:t xml:space="preserve">Engineering Technology &amp; Applied Science</w:t>
-            </w:r>
-          </w:p>
-        </w:tc>
-        <w:tc>
-          <w:tcPr/>
-          <w:p>
-            <w:pPr>
-              <w:pStyle w:val="Compact"/>
-            </w:pPr>
-            <w:hyperlink r:id="rId135">
-              <w:r>
-                <w:rPr>
-                  <w:rStyle w:val="Hyperlink"/>
-                </w:rPr>
-                <w:t xml:space="preserve">link</w:t>
-              </w:r>
-            </w:hyperlink>
-          </w:p>
-        </w:tc>
-      </w:tr>
-      <w:tr>
-        <w:tc>
-          <w:tcPr/>
-          <w:p>
-            <w:pPr>
-              <w:pStyle w:val="Compact"/>
-            </w:pPr>
-            <w:r>
-              <w:t xml:space="preserve">A Deep Learning–Based Framework for Dataset Creation and Sentiment Classification of English–Bengali Code-Mixe</w:t>
-            </w:r>
-          </w:p>
-        </w:tc>
-        <w:tc>
-          <w:tcPr/>
-          <w:p>
-            <w:pPr>
-              <w:pStyle w:val="Compact"/>
-            </w:pPr>
-            <w:r>
-              <w:t xml:space="preserve">2026</w:t>
-            </w:r>
-          </w:p>
-        </w:tc>
-        <w:tc>
-          <w:tcPr/>
-          <w:p>
-            <w:pPr>
-              <w:pStyle w:val="Compact"/>
-            </w:pPr>
-            <w:r>
-              <w:t xml:space="preserve">sentiment</w:t>
-            </w:r>
-          </w:p>
-        </w:tc>
-        <w:tc>
-          <w:tcPr/>
-          <w:p>
-            <w:pPr>
-              <w:pStyle w:val="Compact"/>
-            </w:pPr>
-            <w:r>
-              <w:t xml:space="preserve">Engineering Technology &amp; Applied Science</w:t>
-            </w:r>
-          </w:p>
-        </w:tc>
-        <w:tc>
-          <w:tcPr/>
-          <w:p>
-            <w:pPr>
-              <w:pStyle w:val="Compact"/>
-            </w:pPr>
-            <w:hyperlink r:id="rId136">
-              <w:r>
-                <w:rPr>
-                  <w:rStyle w:val="Hyperlink"/>
-                </w:rPr>
-                <w:t xml:space="preserve">link</w:t>
-              </w:r>
-            </w:hyperlink>
-          </w:p>
-        </w:tc>
-      </w:tr>
-      <w:tr>
-        <w:tc>
-          <w:tcPr/>
-          <w:p>
-            <w:pPr>
-              <w:pStyle w:val="Compact"/>
-            </w:pPr>
-            <w:r>
-              <w:t xml:space="preserve">A multi-class classification approach for feminist sentiment analysis in Bangla social media using TF-IDF and</w:t>
-            </w:r>
-          </w:p>
-        </w:tc>
-        <w:tc>
-          <w:tcPr/>
-          <w:p>
-            <w:pPr>
-              <w:pStyle w:val="Compact"/>
-            </w:pPr>
-            <w:r>
-              <w:t xml:space="preserve">2026</w:t>
-            </w:r>
-          </w:p>
-        </w:tc>
-        <w:tc>
-          <w:tcPr/>
-          <w:p>
-            <w:pPr>
-              <w:pStyle w:val="Compact"/>
-            </w:pPr>
-            <w:r>
-              <w:t xml:space="preserve">sentiment</w:t>
-            </w:r>
-          </w:p>
-        </w:tc>
-        <w:tc>
-          <w:tcPr/>
-          <w:p>
-            <w:pPr>
-              <w:pStyle w:val="Compact"/>
-            </w:pPr>
-            <w:r>
-              <w:t xml:space="preserve">Indonesian Journal of Electrical Enginee</w:t>
-            </w:r>
-          </w:p>
-        </w:tc>
-        <w:tc>
-          <w:tcPr/>
-          <w:p>
-            <w:pPr>
-              <w:pStyle w:val="Compact"/>
-            </w:pPr>
             <w:hyperlink r:id="rId137">
               <w:r>
                 <w:rPr>
@@ -24759,7 +24529,7 @@
               <w:pStyle w:val="Compact"/>
             </w:pPr>
             <w:r>
-              <w:t xml:space="preserve">SSABE-TSCM: drift-aware and interpretable financial sentiment analysis for low-resource Bangla via adaptive se</w:t>
+              <w:t xml:space="preserve">A Novel Dual-Order Hybrid BiLSTM–BiGRU Ensemble Model for English-Bengali Code-Mixed Sentiment Analysis</w:t>
             </w:r>
           </w:p>
         </w:tc>
@@ -24792,7 +24562,7 @@
               <w:pStyle w:val="Compact"/>
             </w:pPr>
             <w:r>
-              <w:t xml:space="preserve">Frontiers in Artificial Intelligence</w:t>
+              <w:t xml:space="preserve">Engineering Technology &amp; Applied Science</w:t>
             </w:r>
           </w:p>
         </w:tc>
@@ -24821,7 +24591,7 @@
               <w:pStyle w:val="Compact"/>
             </w:pPr>
             <w:r>
-              <w:t xml:space="preserve">Two-Stage Bengali Sentiment Classification: Domain Adaptation Through Continual Learning and Parameter-Efficie</w:t>
+              <w:t xml:space="preserve">A Deep Learning–Based Framework for Dataset Creation and Sentiment Classification of English–Bengali Code-Mixe</w:t>
             </w:r>
           </w:p>
         </w:tc>
@@ -24854,7 +24624,7 @@
               <w:pStyle w:val="Compact"/>
             </w:pPr>
             <w:r>
-              <w:t xml:space="preserve">arXiv</w:t>
+              <w:t xml:space="preserve">Engineering Technology &amp; Applied Science</w:t>
             </w:r>
           </w:p>
         </w:tc>
@@ -24883,7 +24653,7 @@
               <w:pStyle w:val="Compact"/>
             </w:pPr>
             <w:r>
-              <w:t xml:space="preserve">Beyond Polarity in Bengali Texts: Can Multi-Task Modeling Capture Sarcasm Intensity and Classification?</w:t>
+              <w:t xml:space="preserve">A multi-class classification approach for feminist sentiment analysis in Bangla social media using TF-IDF and</w:t>
             </w:r>
           </w:p>
         </w:tc>
@@ -24916,7 +24686,7 @@
               <w:pStyle w:val="Compact"/>
             </w:pPr>
             <w:r>
-              <w:t xml:space="preserve">IEEE Open Journal of the Computer Societ</w:t>
+              <w:t xml:space="preserve">Indonesian Journal of Electrical Enginee</w:t>
             </w:r>
           </w:p>
         </w:tc>
@@ -24945,7 +24715,7 @@
               <w:pStyle w:val="Compact"/>
             </w:pPr>
             <w:r>
-              <w:t xml:space="preserve">A Multi-Model Approach to English-Bangla Sentiment Classification of Government Mobile Banking App Reviews</w:t>
+              <w:t xml:space="preserve">SSABE-TSCM: drift-aware and interpretable financial sentiment analysis for low-resource Bangla via adaptive se</w:t>
             </w:r>
           </w:p>
         </w:tc>
@@ -24978,7 +24748,7 @@
               <w:pStyle w:val="Compact"/>
             </w:pPr>
             <w:r>
-              <w:t xml:space="preserve">arXiv</w:t>
+              <w:t xml:space="preserve">Frontiers in Artificial Intelligence</w:t>
             </w:r>
           </w:p>
         </w:tc>
@@ -25007,7 +24777,7 @@
               <w:pStyle w:val="Compact"/>
             </w:pPr>
             <w:r>
-              <w:t xml:space="preserve">BABSA: A large scale bangla aspect based sentiment analysis dataset</w:t>
+              <w:t xml:space="preserve">Two-Stage Bengali Sentiment Classification: Domain Adaptation Through Continual Learning and Parameter-Efficie</w:t>
             </w:r>
           </w:p>
         </w:tc>
@@ -25040,7 +24810,7 @@
               <w:pStyle w:val="Compact"/>
             </w:pPr>
             <w:r>
-              <w:t xml:space="preserve">Data in Brief</w:t>
+              <w:t xml:space="preserve">arXiv</w:t>
             </w:r>
           </w:p>
         </w:tc>
@@ -25069,7 +24839,7 @@
               <w:pStyle w:val="Compact"/>
             </w:pPr>
             <w:r>
-              <w:t xml:space="preserve">BAN-ASTE: A unified neural framework for Bengali aspect sentiment triplet extraction</w:t>
+              <w:t xml:space="preserve">Beyond Polarity in Bengali Texts: Can Multi-Task Modeling Capture Sarcasm Intensity and Classification?</w:t>
             </w:r>
           </w:p>
         </w:tc>
@@ -25102,7 +24872,7 @@
               <w:pStyle w:val="Compact"/>
             </w:pPr>
             <w:r>
-              <w:t xml:space="preserve">Natural Language Processing Journal</w:t>
+              <w:t xml:space="preserve">IEEE Open Journal of the Computer Societ</w:t>
             </w:r>
           </w:p>
         </w:tc>
@@ -25123,9 +24893,195 @@
           </w:p>
         </w:tc>
       </w:tr>
+      <w:tr>
+        <w:tc>
+          <w:tcPr/>
+          <w:p>
+            <w:pPr>
+              <w:pStyle w:val="Compact"/>
+            </w:pPr>
+            <w:r>
+              <w:t xml:space="preserve">A Multi-Model Approach to English-Bangla Sentiment Classification of Government Mobile Banking App Reviews</w:t>
+            </w:r>
+          </w:p>
+        </w:tc>
+        <w:tc>
+          <w:tcPr/>
+          <w:p>
+            <w:pPr>
+              <w:pStyle w:val="Compact"/>
+            </w:pPr>
+            <w:r>
+              <w:t xml:space="preserve">2026</w:t>
+            </w:r>
+          </w:p>
+        </w:tc>
+        <w:tc>
+          <w:tcPr/>
+          <w:p>
+            <w:pPr>
+              <w:pStyle w:val="Compact"/>
+            </w:pPr>
+            <w:r>
+              <w:t xml:space="preserve">sentiment</w:t>
+            </w:r>
+          </w:p>
+        </w:tc>
+        <w:tc>
+          <w:tcPr/>
+          <w:p>
+            <w:pPr>
+              <w:pStyle w:val="Compact"/>
+            </w:pPr>
+            <w:r>
+              <w:t xml:space="preserve">arXiv</w:t>
+            </w:r>
+          </w:p>
+        </w:tc>
+        <w:tc>
+          <w:tcPr/>
+          <w:p>
+            <w:pPr>
+              <w:pStyle w:val="Compact"/>
+            </w:pPr>
+            <w:hyperlink r:id="rId144">
+              <w:r>
+                <w:rPr>
+                  <w:rStyle w:val="Hyperlink"/>
+                </w:rPr>
+                <w:t xml:space="preserve">link</w:t>
+              </w:r>
+            </w:hyperlink>
+          </w:p>
+        </w:tc>
+      </w:tr>
+      <w:tr>
+        <w:tc>
+          <w:tcPr/>
+          <w:p>
+            <w:pPr>
+              <w:pStyle w:val="Compact"/>
+            </w:pPr>
+            <w:r>
+              <w:t xml:space="preserve">BABSA: A large scale bangla aspect based sentiment analysis dataset</w:t>
+            </w:r>
+          </w:p>
+        </w:tc>
+        <w:tc>
+          <w:tcPr/>
+          <w:p>
+            <w:pPr>
+              <w:pStyle w:val="Compact"/>
+            </w:pPr>
+            <w:r>
+              <w:t xml:space="preserve">2026</w:t>
+            </w:r>
+          </w:p>
+        </w:tc>
+        <w:tc>
+          <w:tcPr/>
+          <w:p>
+            <w:pPr>
+              <w:pStyle w:val="Compact"/>
+            </w:pPr>
+            <w:r>
+              <w:t xml:space="preserve">sentiment</w:t>
+            </w:r>
+          </w:p>
+        </w:tc>
+        <w:tc>
+          <w:tcPr/>
+          <w:p>
+            <w:pPr>
+              <w:pStyle w:val="Compact"/>
+            </w:pPr>
+            <w:r>
+              <w:t xml:space="preserve">Data in Brief</w:t>
+            </w:r>
+          </w:p>
+        </w:tc>
+        <w:tc>
+          <w:tcPr/>
+          <w:p>
+            <w:pPr>
+              <w:pStyle w:val="Compact"/>
+            </w:pPr>
+            <w:hyperlink r:id="rId145">
+              <w:r>
+                <w:rPr>
+                  <w:rStyle w:val="Hyperlink"/>
+                </w:rPr>
+                <w:t xml:space="preserve">link</w:t>
+              </w:r>
+            </w:hyperlink>
+          </w:p>
+        </w:tc>
+      </w:tr>
+      <w:tr>
+        <w:tc>
+          <w:tcPr/>
+          <w:p>
+            <w:pPr>
+              <w:pStyle w:val="Compact"/>
+            </w:pPr>
+            <w:r>
+              <w:t xml:space="preserve">BAN-ASTE: A unified neural framework for Bengali aspect sentiment triplet extraction</w:t>
+            </w:r>
+          </w:p>
+        </w:tc>
+        <w:tc>
+          <w:tcPr/>
+          <w:p>
+            <w:pPr>
+              <w:pStyle w:val="Compact"/>
+            </w:pPr>
+            <w:r>
+              <w:t xml:space="preserve">2026</w:t>
+            </w:r>
+          </w:p>
+        </w:tc>
+        <w:tc>
+          <w:tcPr/>
+          <w:p>
+            <w:pPr>
+              <w:pStyle w:val="Compact"/>
+            </w:pPr>
+            <w:r>
+              <w:t xml:space="preserve">sentiment</w:t>
+            </w:r>
+          </w:p>
+        </w:tc>
+        <w:tc>
+          <w:tcPr/>
+          <w:p>
+            <w:pPr>
+              <w:pStyle w:val="Compact"/>
+            </w:pPr>
+            <w:r>
+              <w:t xml:space="preserve">Natural Language Processing Journal</w:t>
+            </w:r>
+          </w:p>
+        </w:tc>
+        <w:tc>
+          <w:tcPr/>
+          <w:p>
+            <w:pPr>
+              <w:pStyle w:val="Compact"/>
+            </w:pPr>
+            <w:hyperlink r:id="rId146">
+              <w:r>
+                <w:rPr>
+                  <w:rStyle w:val="Hyperlink"/>
+                </w:rPr>
+                <w:t xml:space="preserve">link</w:t>
+              </w:r>
+            </w:hyperlink>
+          </w:p>
+        </w:tc>
+      </w:tr>
     </w:tbl>
-    <w:bookmarkEnd w:id="144"/>
-    <w:bookmarkStart w:id="146" w:name="tool-1"/>
+    <w:bookmarkEnd w:id="147"/>
+    <w:bookmarkStart w:id="149" w:name="tool-1"/>
     <w:p>
       <w:pPr>
         <w:pStyle w:val="Heading5"/>
@@ -25258,7 +25214,7 @@
             <w:pPr>
               <w:pStyle w:val="Compact"/>
             </w:pPr>
-            <w:hyperlink r:id="rId145">
+            <w:hyperlink r:id="rId148">
               <w:r>
                 <w:rPr>
                   <w:rStyle w:val="Hyperlink"/>
@@ -25277,10 +25233,10 @@
         </w:pict>
       </w:r>
     </w:p>
-    <w:bookmarkEnd w:id="146"/>
-    <w:bookmarkEnd w:id="147"/>
-    <w:bookmarkEnd w:id="148"/>
-    <w:bookmarkStart w:id="150" w:name="references-1"/>
+    <w:bookmarkEnd w:id="149"/>
+    <w:bookmarkEnd w:id="150"/>
+    <w:bookmarkEnd w:id="151"/>
+    <w:bookmarkStart w:id="153" w:name="references-1"/>
     <w:p>
       <w:pPr>
         <w:pStyle w:val="Heading2"/>
@@ -26004,7 +25960,7 @@
         </w:pict>
       </w:r>
     </w:p>
-    <w:bookmarkStart w:id="149" w:name="bibtex-source"/>
+    <w:bookmarkStart w:id="152" w:name="bibtex-source"/>
     <w:p>
       <w:pPr>
         <w:pStyle w:val="Heading3"/>
@@ -29949,9 +29905,9 @@
         </w:pict>
       </w:r>
     </w:p>
-    <w:bookmarkEnd w:id="149"/>
-    <w:bookmarkEnd w:id="150"/>
-    <w:bookmarkStart w:id="152" w:name="appendix-b-repository-manifest"/>
+    <w:bookmarkEnd w:id="152"/>
+    <w:bookmarkEnd w:id="153"/>
+    <w:bookmarkStart w:id="155" w:name="appendix-b-repository-manifest"/>
     <w:p>
       <w:pPr>
         <w:pStyle w:val="Heading2"/>
@@ -30662,7 +30618,7 @@
         </w:tc>
       </w:tr>
     </w:tbl>
-    <w:bookmarkStart w:id="151" w:name="local-folder-location"/>
+    <w:bookmarkStart w:id="154" w:name="local-folder-location"/>
     <w:p>
       <w:pPr>
         <w:pStyle w:val="Heading3"/>
@@ -30690,9 +30646,9 @@
         <w:t xml:space="preserve">D:\Documents\qwen-agent\lUinoenfmc\default\Developing-a-Bangla-Sentiment-Analysis-System-Using-Fine-Tuned-BERT-Models</w:t>
       </w:r>
     </w:p>
-    <w:bookmarkEnd w:id="151"/>
-    <w:bookmarkEnd w:id="152"/>
-    <w:bookmarkEnd w:id="153"/>
+    <w:bookmarkEnd w:id="154"/>
+    <w:bookmarkEnd w:id="155"/>
+    <w:bookmarkEnd w:id="156"/>
     <w:sectPr>
       <w:footnotePr>
         <w:numRestart w:val="eachSect"/>

</xml_diff>

<commit_message>
fix(docs): purge local workstation folder paths and sanitize notebook outputs
- Remove hardcoded Windows agent path D:\Documents\qwen-agent\lUinoenfmc from README.md and paper Appendix B
- Replace local folder location references with canonical GitHub repository URL
- Rebuild paper Markdown (14,007 words) and recompile binary Word .docx files via Pandoc
- Rebuild notebooks to strip local user workstation environment outputs
- Enhance tools/sanitize_artifacts.py and tools/verify_docx.py with path leak detection guardrails
</commit_message>
<xml_diff>
--- a/docs/assets/CSE432_Bangla_Sentiment_BERT_Paper.docx
+++ b/docs/assets/CSE432_Bangla_Sentiment_BERT_Paper.docx
@@ -2,7 +2,7 @@
 <file path=word/document.xml><?xml version="1.0" encoding="utf-8"?>
 <w:document xmlns:w="http://schemas.openxmlformats.org/wordprocessingml/2006/main" xmlns:m="http://schemas.openxmlformats.org/officeDocument/2006/math" xmlns:r="http://schemas.openxmlformats.org/officeDocument/2006/relationships" xmlns:o="urn:schemas-microsoft-com:office:office" xmlns:v="urn:schemas-microsoft-com:vml" xmlns:w10="urn:schemas-microsoft-com:office:word" xmlns:a="http://schemas.openxmlformats.org/drawingml/2006/main" xmlns:pic="http://schemas.openxmlformats.org/drawingml/2006/picture" xmlns:wp="http://schemas.openxmlformats.org/drawingml/2006/wordprocessingDrawing">
   <w:body>
-    <w:bookmarkStart w:id="156" w:name="X2ee5368e90af5e8fdf8d6a5527f72c71c3c0126"/>
+    <w:bookmarkStart w:id="157" w:name="X2ee5368e90af5e8fdf8d6a5527f72c71c3c0126"/>
     <w:p>
       <w:pPr>
         <w:pStyle w:val="Heading1"/>
@@ -29907,7 +29907,7 @@
     </w:p>
     <w:bookmarkEnd w:id="152"/>
     <w:bookmarkEnd w:id="153"/>
-    <w:bookmarkStart w:id="155" w:name="appendix-b-repository-manifest"/>
+    <w:bookmarkStart w:id="156" w:name="appendix-b-repository-manifest"/>
     <w:p>
       <w:pPr>
         <w:pStyle w:val="Heading2"/>
@@ -29976,7 +29976,7 @@
               <w:pStyle w:val="Compact"/>
             </w:pPr>
             <w:r>
-              <w:t xml:space="preserve">Colab buttons, dataset roles, contributor table, local folder location</w:t>
+              <w:t xml:space="preserve">Colab buttons, dataset roles, contributor table, replication guide</w:t>
             </w:r>
           </w:p>
         </w:tc>
@@ -30618,13 +30618,13 @@
         </w:tc>
       </w:tr>
     </w:tbl>
-    <w:bookmarkStart w:id="154" w:name="local-folder-location"/>
+    <w:bookmarkStart w:id="155" w:name="repository-url"/>
     <w:p>
       <w:pPr>
         <w:pStyle w:val="Heading3"/>
       </w:pPr>
       <w:r>
-        <w:t xml:space="preserve">Local folder location</w:t>
+        <w:t xml:space="preserve">Repository URL</w:t>
       </w:r>
     </w:p>
     <w:p>
@@ -30632,23 +30632,25 @@
         <w:pStyle w:val="FirstParagraph"/>
       </w:pPr>
       <w:r>
-        <w:t xml:space="preserve">This repository is located on the local PC at:</w:t>
-      </w:r>
-    </w:p>
-    <w:p>
-      <w:pPr>
-        <w:pStyle w:val="SourceCode"/>
-      </w:pPr>
-      <w:r>
-        <w:rPr>
-          <w:rStyle w:val="VerbatimChar"/>
-        </w:rPr>
-        <w:t xml:space="preserve">D:\Documents\qwen-agent\lUinoenfmc\default\Developing-a-Bangla-Sentiment-Analysis-System-Using-Fine-Tuned-BERT-Models</w:t>
-      </w:r>
-    </w:p>
-    <w:bookmarkEnd w:id="154"/>
+        <w:t xml:space="preserve">The complete source code, preprocessed data manifests, and diagnostic figures are maintained on GitHub at:</w:t>
+      </w:r>
+    </w:p>
+    <w:p>
+      <w:pPr>
+        <w:pStyle w:val="BodyText"/>
+      </w:pPr>
+      <w:hyperlink r:id="rId154">
+        <w:r>
+          <w:rPr>
+            <w:rStyle w:val="Hyperlink"/>
+          </w:rPr>
+          <w:t xml:space="preserve">https://github.com/ShoumikBalaSomu/Developing-a-Bangla-Sentiment-Analysis-System-Using-Fine-Tuned-BERT-Models</w:t>
+        </w:r>
+      </w:hyperlink>
+    </w:p>
     <w:bookmarkEnd w:id="155"/>
     <w:bookmarkEnd w:id="156"/>
+    <w:bookmarkEnd w:id="157"/>
     <w:sectPr>
       <w:footnotePr>
         <w:numRestart w:val="eachSect"/>

</xml_diff>

<commit_message>
feat(docs): integrate enhanced system architecture diagram with orthogonal connectors
- Adopt overhauled system overview generator with orthogonal connectors and pill badges
- Sanitize sandbox path references in tools/generate_system_overview.py with portable repo-relative resolution
- Regenerate results/system_overview.png and docs/assets/images/system_overview.png (zero label collisions)
- Recompile paper/CSE432_Bangla_Sentiment_BERT_Paper.docx and docs/assets/ copy with updated diagram
- Validate all 16 test gates, secret scans, and docx verification rules
</commit_message>
<xml_diff>
--- a/docs/assets/CSE432_Bangla_Sentiment_BERT_Paper.docx
+++ b/docs/assets/CSE432_Bangla_Sentiment_BERT_Paper.docx
@@ -4667,7 +4667,7 @@
       <w:r>
         <w:drawing>
           <wp:inline>
-            <wp:extent cx="5334000" cy="3187775"/>
+            <wp:extent cx="5334000" cy="2926861"/>
             <wp:effectExtent b="0" l="0" r="0" t="0"/>
             <wp:docPr descr="Figure 3.1: System Architecture and Pipeline Data Flow" title="" id="35" name="Picture"/>
             <a:graphic>
@@ -4688,7 +4688,7 @@
                   <pic:spPr bwMode="auto">
                     <a:xfrm>
                       <a:off x="0" y="0"/>
-                      <a:ext cx="5334000" cy="3187775"/>
+                      <a:ext cx="5334000" cy="2926861"/>
                     </a:xfrm>
                     <a:prstGeom prst="rect">
                       <a:avLst/>

</xml_diff>